<commit_message>
fix(spettri): verifica campo di isolamento e integrazione Wiki F3
</commit_message>
<xml_diff>
--- a/supporto/documentazione/Guide_ANTHEA/ANTHEA_Guida_pratica_ITEC_Rev48.docx
+++ b/supporto/documentazione/Guide_ANTHEA/ANTHEA_Guida_pratica_ITEC_Rev48.docx
@@ -2334,7 +2334,7 @@
       <w:r>
         <w:fldChar w:fldCharType="separate"/>
       </w:r>
-      <w:hyperlink w:anchor="_Toc243264334" w:history="1">
+      <w:hyperlink w:anchor="_Toc243267380" w:history="1">
         <w:r>
           <w:rPr>
             <w:rStyle w:val="Collegamentoipertestuale"/>
@@ -2382,7 +2382,7 @@
             <w:noProof/>
             <w:webHidden/>
           </w:rPr>
-          <w:instrText xml:space="preserve"> PAGEREF _Toc243264334 \h </w:instrText>
+          <w:instrText xml:space="preserve"> PAGEREF _Toc243267380 \h </w:instrText>
         </w:r>
         <w:r>
           <w:rPr>
@@ -2429,7 +2429,7 @@
           <w14:ligatures w14:val="standardContextual"/>
         </w:rPr>
       </w:pPr>
-      <w:hyperlink w:anchor="_Toc243264335" w:history="1">
+      <w:hyperlink w:anchor="_Toc243267381" w:history="1">
         <w:r>
           <w:rPr>
             <w:rStyle w:val="Collegamentoipertestuale"/>
@@ -2474,7 +2474,7 @@
             <w:noProof/>
             <w:webHidden/>
           </w:rPr>
-          <w:instrText xml:space="preserve"> PAGEREF _Toc243264335 \h </w:instrText>
+          <w:instrText xml:space="preserve"> PAGEREF _Toc243267381 \h </w:instrText>
         </w:r>
         <w:r>
           <w:rPr>
@@ -2521,7 +2521,7 @@
           <w14:ligatures w14:val="standardContextual"/>
         </w:rPr>
       </w:pPr>
-      <w:hyperlink w:anchor="_Toc243264336" w:history="1">
+      <w:hyperlink w:anchor="_Toc243267382" w:history="1">
         <w:r>
           <w:rPr>
             <w:rStyle w:val="Collegamentoipertestuale"/>
@@ -2566,7 +2566,7 @@
             <w:noProof/>
             <w:webHidden/>
           </w:rPr>
-          <w:instrText xml:space="preserve"> PAGEREF _Toc243264336 \h </w:instrText>
+          <w:instrText xml:space="preserve"> PAGEREF _Toc243267382 \h </w:instrText>
         </w:r>
         <w:r>
           <w:rPr>
@@ -2613,7 +2613,7 @@
           <w14:ligatures w14:val="standardContextual"/>
         </w:rPr>
       </w:pPr>
-      <w:hyperlink w:anchor="_Toc243264337" w:history="1">
+      <w:hyperlink w:anchor="_Toc243267383" w:history="1">
         <w:r>
           <w:rPr>
             <w:rStyle w:val="Collegamentoipertestuale"/>
@@ -2658,7 +2658,7 @@
             <w:noProof/>
             <w:webHidden/>
           </w:rPr>
-          <w:instrText xml:space="preserve"> PAGEREF _Toc243264337 \h </w:instrText>
+          <w:instrText xml:space="preserve"> PAGEREF _Toc243267383 \h </w:instrText>
         </w:r>
         <w:r>
           <w:rPr>
@@ -2705,7 +2705,7 @@
           <w14:ligatures w14:val="standardContextual"/>
         </w:rPr>
       </w:pPr>
-      <w:hyperlink w:anchor="_Toc243264338" w:history="1">
+      <w:hyperlink w:anchor="_Toc243267384" w:history="1">
         <w:r>
           <w:rPr>
             <w:rStyle w:val="Collegamentoipertestuale"/>
@@ -2750,7 +2750,7 @@
             <w:noProof/>
             <w:webHidden/>
           </w:rPr>
-          <w:instrText xml:space="preserve"> PAGEREF _Toc243264338 \h </w:instrText>
+          <w:instrText xml:space="preserve"> PAGEREF _Toc243267384 \h </w:instrText>
         </w:r>
         <w:r>
           <w:rPr>
@@ -2796,7 +2796,7 @@
           <w14:ligatures w14:val="standardContextual"/>
         </w:rPr>
       </w:pPr>
-      <w:hyperlink w:anchor="_Toc243264339" w:history="1">
+      <w:hyperlink w:anchor="_Toc243267385" w:history="1">
         <w:r>
           <w:rPr>
             <w:rStyle w:val="Collegamentoipertestuale"/>
@@ -2844,7 +2844,7 @@
             <w:noProof/>
             <w:webHidden/>
           </w:rPr>
-          <w:instrText xml:space="preserve"> PAGEREF _Toc243264339 \h </w:instrText>
+          <w:instrText xml:space="preserve"> PAGEREF _Toc243267385 \h </w:instrText>
         </w:r>
         <w:r>
           <w:rPr>
@@ -2891,7 +2891,7 @@
           <w14:ligatures w14:val="standardContextual"/>
         </w:rPr>
       </w:pPr>
-      <w:hyperlink w:anchor="_Toc243264340" w:history="1">
+      <w:hyperlink w:anchor="_Toc243267386" w:history="1">
         <w:r>
           <w:rPr>
             <w:rStyle w:val="Collegamentoipertestuale"/>
@@ -2936,7 +2936,7 @@
             <w:noProof/>
             <w:webHidden/>
           </w:rPr>
-          <w:instrText xml:space="preserve"> PAGEREF _Toc243264340 \h </w:instrText>
+          <w:instrText xml:space="preserve"> PAGEREF _Toc243267386 \h </w:instrText>
         </w:r>
         <w:r>
           <w:rPr>
@@ -2983,7 +2983,7 @@
           <w14:ligatures w14:val="standardContextual"/>
         </w:rPr>
       </w:pPr>
-      <w:hyperlink w:anchor="_Toc243264341" w:history="1">
+      <w:hyperlink w:anchor="_Toc243267387" w:history="1">
         <w:r>
           <w:rPr>
             <w:rStyle w:val="Collegamentoipertestuale"/>
@@ -3028,7 +3028,7 @@
             <w:noProof/>
             <w:webHidden/>
           </w:rPr>
-          <w:instrText xml:space="preserve"> PAGEREF _Toc243264341 \h </w:instrText>
+          <w:instrText xml:space="preserve"> PAGEREF _Toc243267387 \h </w:instrText>
         </w:r>
         <w:r>
           <w:rPr>
@@ -3075,7 +3075,7 @@
           <w14:ligatures w14:val="standardContextual"/>
         </w:rPr>
       </w:pPr>
-      <w:hyperlink w:anchor="_Toc243264342" w:history="1">
+      <w:hyperlink w:anchor="_Toc243267388" w:history="1">
         <w:r>
           <w:rPr>
             <w:rStyle w:val="Collegamentoipertestuale"/>
@@ -3120,7 +3120,7 @@
             <w:noProof/>
             <w:webHidden/>
           </w:rPr>
-          <w:instrText xml:space="preserve"> PAGEREF _Toc243264342 \h </w:instrText>
+          <w:instrText xml:space="preserve"> PAGEREF _Toc243267388 \h </w:instrText>
         </w:r>
         <w:r>
           <w:rPr>
@@ -3167,7 +3167,7 @@
           <w14:ligatures w14:val="standardContextual"/>
         </w:rPr>
       </w:pPr>
-      <w:hyperlink w:anchor="_Toc243264343" w:history="1">
+      <w:hyperlink w:anchor="_Toc243267389" w:history="1">
         <w:r>
           <w:rPr>
             <w:rStyle w:val="Collegamentoipertestuale"/>
@@ -3212,7 +3212,7 @@
             <w:noProof/>
             <w:webHidden/>
           </w:rPr>
-          <w:instrText xml:space="preserve"> PAGEREF _Toc243264343 \h </w:instrText>
+          <w:instrText xml:space="preserve"> PAGEREF _Toc243267389 \h </w:instrText>
         </w:r>
         <w:r>
           <w:rPr>
@@ -3258,7 +3258,7 @@
           <w14:ligatures w14:val="standardContextual"/>
         </w:rPr>
       </w:pPr>
-      <w:hyperlink w:anchor="_Toc243264344" w:history="1">
+      <w:hyperlink w:anchor="_Toc243267390" w:history="1">
         <w:r>
           <w:rPr>
             <w:rStyle w:val="Collegamentoipertestuale"/>
@@ -3306,7 +3306,7 @@
             <w:noProof/>
             <w:webHidden/>
           </w:rPr>
-          <w:instrText xml:space="preserve"> PAGEREF _Toc243264344 \h </w:instrText>
+          <w:instrText xml:space="preserve"> PAGEREF _Toc243267390 \h </w:instrText>
         </w:r>
         <w:r>
           <w:rPr>
@@ -3353,7 +3353,7 @@
           <w14:ligatures w14:val="standardContextual"/>
         </w:rPr>
       </w:pPr>
-      <w:hyperlink w:anchor="_Toc243264345" w:history="1">
+      <w:hyperlink w:anchor="_Toc243267391" w:history="1">
         <w:r>
           <w:rPr>
             <w:rStyle w:val="Collegamentoipertestuale"/>
@@ -3398,7 +3398,7 @@
             <w:noProof/>
             <w:webHidden/>
           </w:rPr>
-          <w:instrText xml:space="preserve"> PAGEREF _Toc243264345 \h </w:instrText>
+          <w:instrText xml:space="preserve"> PAGEREF _Toc243267391 \h </w:instrText>
         </w:r>
         <w:r>
           <w:rPr>
@@ -3445,7 +3445,7 @@
           <w14:ligatures w14:val="standardContextual"/>
         </w:rPr>
       </w:pPr>
-      <w:hyperlink w:anchor="_Toc243264346" w:history="1">
+      <w:hyperlink w:anchor="_Toc243267392" w:history="1">
         <w:r>
           <w:rPr>
             <w:rStyle w:val="Collegamentoipertestuale"/>
@@ -3490,7 +3490,7 @@
             <w:noProof/>
             <w:webHidden/>
           </w:rPr>
-          <w:instrText xml:space="preserve"> PAGEREF _Toc243264346 \h </w:instrText>
+          <w:instrText xml:space="preserve"> PAGEREF _Toc243267392 \h </w:instrText>
         </w:r>
         <w:r>
           <w:rPr>
@@ -3537,7 +3537,7 @@
           <w14:ligatures w14:val="standardContextual"/>
         </w:rPr>
       </w:pPr>
-      <w:hyperlink w:anchor="_Toc243264347" w:history="1">
+      <w:hyperlink w:anchor="_Toc243267393" w:history="1">
         <w:r>
           <w:rPr>
             <w:rStyle w:val="Collegamentoipertestuale"/>
@@ -3582,7 +3582,7 @@
             <w:noProof/>
             <w:webHidden/>
           </w:rPr>
-          <w:instrText xml:space="preserve"> PAGEREF _Toc243264347 \h </w:instrText>
+          <w:instrText xml:space="preserve"> PAGEREF _Toc243267393 \h </w:instrText>
         </w:r>
         <w:r>
           <w:rPr>
@@ -3629,7 +3629,7 @@
           <w14:ligatures w14:val="standardContextual"/>
         </w:rPr>
       </w:pPr>
-      <w:hyperlink w:anchor="_Toc243264348" w:history="1">
+      <w:hyperlink w:anchor="_Toc243267394" w:history="1">
         <w:r>
           <w:rPr>
             <w:rStyle w:val="Collegamentoipertestuale"/>
@@ -3674,7 +3674,7 @@
             <w:noProof/>
             <w:webHidden/>
           </w:rPr>
-          <w:instrText xml:space="preserve"> PAGEREF _Toc243264348 \h </w:instrText>
+          <w:instrText xml:space="preserve"> PAGEREF _Toc243267394 \h </w:instrText>
         </w:r>
         <w:r>
           <w:rPr>
@@ -3720,7 +3720,7 @@
           <w14:ligatures w14:val="standardContextual"/>
         </w:rPr>
       </w:pPr>
-      <w:hyperlink w:anchor="_Toc243264349" w:history="1">
+      <w:hyperlink w:anchor="_Toc243267395" w:history="1">
         <w:r>
           <w:rPr>
             <w:rStyle w:val="Collegamentoipertestuale"/>
@@ -3768,7 +3768,7 @@
             <w:noProof/>
             <w:webHidden/>
           </w:rPr>
-          <w:instrText xml:space="preserve"> PAGEREF _Toc243264349 \h </w:instrText>
+          <w:instrText xml:space="preserve"> PAGEREF _Toc243267395 \h </w:instrText>
         </w:r>
         <w:r>
           <w:rPr>
@@ -3815,7 +3815,7 @@
           <w14:ligatures w14:val="standardContextual"/>
         </w:rPr>
       </w:pPr>
-      <w:hyperlink w:anchor="_Toc243264350" w:history="1">
+      <w:hyperlink w:anchor="_Toc243267396" w:history="1">
         <w:r>
           <w:rPr>
             <w:rStyle w:val="Collegamentoipertestuale"/>
@@ -3860,7 +3860,7 @@
             <w:noProof/>
             <w:webHidden/>
           </w:rPr>
-          <w:instrText xml:space="preserve"> PAGEREF _Toc243264350 \h </w:instrText>
+          <w:instrText xml:space="preserve"> PAGEREF _Toc243267396 \h </w:instrText>
         </w:r>
         <w:r>
           <w:rPr>
@@ -3907,7 +3907,7 @@
           <w14:ligatures w14:val="standardContextual"/>
         </w:rPr>
       </w:pPr>
-      <w:hyperlink w:anchor="_Toc243264351" w:history="1">
+      <w:hyperlink w:anchor="_Toc243267397" w:history="1">
         <w:r>
           <w:rPr>
             <w:rStyle w:val="Collegamentoipertestuale"/>
@@ -3952,7 +3952,7 @@
             <w:noProof/>
             <w:webHidden/>
           </w:rPr>
-          <w:instrText xml:space="preserve"> PAGEREF _Toc243264351 \h </w:instrText>
+          <w:instrText xml:space="preserve"> PAGEREF _Toc243267397 \h </w:instrText>
         </w:r>
         <w:r>
           <w:rPr>
@@ -3999,7 +3999,7 @@
           <w14:ligatures w14:val="standardContextual"/>
         </w:rPr>
       </w:pPr>
-      <w:hyperlink w:anchor="_Toc243264352" w:history="1">
+      <w:hyperlink w:anchor="_Toc243267398" w:history="1">
         <w:r>
           <w:rPr>
             <w:rStyle w:val="Collegamentoipertestuale"/>
@@ -4044,7 +4044,7 @@
             <w:noProof/>
             <w:webHidden/>
           </w:rPr>
-          <w:instrText xml:space="preserve"> PAGEREF _Toc243264352 \h </w:instrText>
+          <w:instrText xml:space="preserve"> PAGEREF _Toc243267398 \h </w:instrText>
         </w:r>
         <w:r>
           <w:rPr>
@@ -4091,7 +4091,7 @@
           <w14:ligatures w14:val="standardContextual"/>
         </w:rPr>
       </w:pPr>
-      <w:hyperlink w:anchor="_Toc243264353" w:history="1">
+      <w:hyperlink w:anchor="_Toc243267399" w:history="1">
         <w:r>
           <w:rPr>
             <w:rStyle w:val="Collegamentoipertestuale"/>
@@ -4136,7 +4136,7 @@
             <w:noProof/>
             <w:webHidden/>
           </w:rPr>
-          <w:instrText xml:space="preserve"> PAGEREF _Toc243264353 \h </w:instrText>
+          <w:instrText xml:space="preserve"> PAGEREF _Toc243267399 \h </w:instrText>
         </w:r>
         <w:r>
           <w:rPr>
@@ -4183,7 +4183,7 @@
           <w14:ligatures w14:val="standardContextual"/>
         </w:rPr>
       </w:pPr>
-      <w:hyperlink w:anchor="_Toc243264354" w:history="1">
+      <w:hyperlink w:anchor="_Toc243267400" w:history="1">
         <w:r>
           <w:rPr>
             <w:rStyle w:val="Collegamentoipertestuale"/>
@@ -4228,7 +4228,7 @@
             <w:noProof/>
             <w:webHidden/>
           </w:rPr>
-          <w:instrText xml:space="preserve"> PAGEREF _Toc243264354 \h </w:instrText>
+          <w:instrText xml:space="preserve"> PAGEREF _Toc243267400 \h </w:instrText>
         </w:r>
         <w:r>
           <w:rPr>
@@ -4275,7 +4275,7 @@
           <w14:ligatures w14:val="standardContextual"/>
         </w:rPr>
       </w:pPr>
-      <w:hyperlink w:anchor="_Toc243264355" w:history="1">
+      <w:hyperlink w:anchor="_Toc243267401" w:history="1">
         <w:r>
           <w:rPr>
             <w:rStyle w:val="Collegamentoipertestuale"/>
@@ -4320,7 +4320,7 @@
             <w:noProof/>
             <w:webHidden/>
           </w:rPr>
-          <w:instrText xml:space="preserve"> PAGEREF _Toc243264355 \h </w:instrText>
+          <w:instrText xml:space="preserve"> PAGEREF _Toc243267401 \h </w:instrText>
         </w:r>
         <w:r>
           <w:rPr>
@@ -4366,7 +4366,7 @@
           <w14:ligatures w14:val="standardContextual"/>
         </w:rPr>
       </w:pPr>
-      <w:hyperlink w:anchor="_Toc243264356" w:history="1">
+      <w:hyperlink w:anchor="_Toc243267402" w:history="1">
         <w:r>
           <w:rPr>
             <w:rStyle w:val="Collegamentoipertestuale"/>
@@ -4414,7 +4414,7 @@
             <w:noProof/>
             <w:webHidden/>
           </w:rPr>
-          <w:instrText xml:space="preserve"> PAGEREF _Toc243264356 \h </w:instrText>
+          <w:instrText xml:space="preserve"> PAGEREF _Toc243267402 \h </w:instrText>
         </w:r>
         <w:r>
           <w:rPr>
@@ -4461,7 +4461,7 @@
           <w14:ligatures w14:val="standardContextual"/>
         </w:rPr>
       </w:pPr>
-      <w:hyperlink w:anchor="_Toc243264357" w:history="1">
+      <w:hyperlink w:anchor="_Toc243267403" w:history="1">
         <w:r>
           <w:rPr>
             <w:rStyle w:val="Collegamentoipertestuale"/>
@@ -4506,7 +4506,7 @@
             <w:noProof/>
             <w:webHidden/>
           </w:rPr>
-          <w:instrText xml:space="preserve"> PAGEREF _Toc243264357 \h </w:instrText>
+          <w:instrText xml:space="preserve"> PAGEREF _Toc243267403 \h </w:instrText>
         </w:r>
         <w:r>
           <w:rPr>
@@ -4553,7 +4553,7 @@
           <w14:ligatures w14:val="standardContextual"/>
         </w:rPr>
       </w:pPr>
-      <w:hyperlink w:anchor="_Toc243264358" w:history="1">
+      <w:hyperlink w:anchor="_Toc243267404" w:history="1">
         <w:r>
           <w:rPr>
             <w:rStyle w:val="Collegamentoipertestuale"/>
@@ -4598,7 +4598,7 @@
             <w:noProof/>
             <w:webHidden/>
           </w:rPr>
-          <w:instrText xml:space="preserve"> PAGEREF _Toc243264358 \h </w:instrText>
+          <w:instrText xml:space="preserve"> PAGEREF _Toc243267404 \h </w:instrText>
         </w:r>
         <w:r>
           <w:rPr>
@@ -4644,7 +4644,7 @@
           <w14:ligatures w14:val="standardContextual"/>
         </w:rPr>
       </w:pPr>
-      <w:hyperlink w:anchor="_Toc243264359" w:history="1">
+      <w:hyperlink w:anchor="_Toc243267405" w:history="1">
         <w:r>
           <w:rPr>
             <w:rStyle w:val="Collegamentoipertestuale"/>
@@ -4692,7 +4692,7 @@
             <w:noProof/>
             <w:webHidden/>
           </w:rPr>
-          <w:instrText xml:space="preserve"> PAGEREF _Toc243264359 \h </w:instrText>
+          <w:instrText xml:space="preserve"> PAGEREF _Toc243267405 \h </w:instrText>
         </w:r>
         <w:r>
           <w:rPr>
@@ -4739,7 +4739,7 @@
           <w14:ligatures w14:val="standardContextual"/>
         </w:rPr>
       </w:pPr>
-      <w:hyperlink w:anchor="_Toc243264360" w:history="1">
+      <w:hyperlink w:anchor="_Toc243267406" w:history="1">
         <w:r>
           <w:rPr>
             <w:rStyle w:val="Collegamentoipertestuale"/>
@@ -4784,7 +4784,7 @@
             <w:noProof/>
             <w:webHidden/>
           </w:rPr>
-          <w:instrText xml:space="preserve"> PAGEREF _Toc243264360 \h </w:instrText>
+          <w:instrText xml:space="preserve"> PAGEREF _Toc243267406 \h </w:instrText>
         </w:r>
         <w:r>
           <w:rPr>
@@ -4831,7 +4831,7 @@
           <w14:ligatures w14:val="standardContextual"/>
         </w:rPr>
       </w:pPr>
-      <w:hyperlink w:anchor="_Toc243264361" w:history="1">
+      <w:hyperlink w:anchor="_Toc243267407" w:history="1">
         <w:r>
           <w:rPr>
             <w:rStyle w:val="Collegamentoipertestuale"/>
@@ -4876,7 +4876,7 @@
             <w:noProof/>
             <w:webHidden/>
           </w:rPr>
-          <w:instrText xml:space="preserve"> PAGEREF _Toc243264361 \h </w:instrText>
+          <w:instrText xml:space="preserve"> PAGEREF _Toc243267407 \h </w:instrText>
         </w:r>
         <w:r>
           <w:rPr>
@@ -4923,7 +4923,7 @@
           <w14:ligatures w14:val="standardContextual"/>
         </w:rPr>
       </w:pPr>
-      <w:hyperlink w:anchor="_Toc243264362" w:history="1">
+      <w:hyperlink w:anchor="_Toc243267408" w:history="1">
         <w:r>
           <w:rPr>
             <w:rStyle w:val="Collegamentoipertestuale"/>
@@ -4968,7 +4968,7 @@
             <w:noProof/>
             <w:webHidden/>
           </w:rPr>
-          <w:instrText xml:space="preserve"> PAGEREF _Toc243264362 \h </w:instrText>
+          <w:instrText xml:space="preserve"> PAGEREF _Toc243267408 \h </w:instrText>
         </w:r>
         <w:r>
           <w:rPr>
@@ -5015,7 +5015,7 @@
           <w14:ligatures w14:val="standardContextual"/>
         </w:rPr>
       </w:pPr>
-      <w:hyperlink w:anchor="_Toc243264363" w:history="1">
+      <w:hyperlink w:anchor="_Toc243267409" w:history="1">
         <w:r>
           <w:rPr>
             <w:rStyle w:val="Collegamentoipertestuale"/>
@@ -5060,7 +5060,7 @@
             <w:noProof/>
             <w:webHidden/>
           </w:rPr>
-          <w:instrText xml:space="preserve"> PAGEREF _Toc243264363 \h </w:instrText>
+          <w:instrText xml:space="preserve"> PAGEREF _Toc243267409 \h </w:instrText>
         </w:r>
         <w:r>
           <w:rPr>
@@ -5106,7 +5106,7 @@
           <w14:ligatures w14:val="standardContextual"/>
         </w:rPr>
       </w:pPr>
-      <w:hyperlink w:anchor="_Toc243264364" w:history="1">
+      <w:hyperlink w:anchor="_Toc243267410" w:history="1">
         <w:r>
           <w:rPr>
             <w:rStyle w:val="Collegamentoipertestuale"/>
@@ -5154,7 +5154,7 @@
             <w:noProof/>
             <w:webHidden/>
           </w:rPr>
-          <w:instrText xml:space="preserve"> PAGEREF _Toc243264364 \h </w:instrText>
+          <w:instrText xml:space="preserve"> PAGEREF _Toc243267410 \h </w:instrText>
         </w:r>
         <w:r>
           <w:rPr>
@@ -5201,7 +5201,7 @@
           <w14:ligatures w14:val="standardContextual"/>
         </w:rPr>
       </w:pPr>
-      <w:hyperlink w:anchor="_Toc243264365" w:history="1">
+      <w:hyperlink w:anchor="_Toc243267411" w:history="1">
         <w:r>
           <w:rPr>
             <w:rStyle w:val="Collegamentoipertestuale"/>
@@ -5246,7 +5246,7 @@
             <w:noProof/>
             <w:webHidden/>
           </w:rPr>
-          <w:instrText xml:space="preserve"> PAGEREF _Toc243264365 \h </w:instrText>
+          <w:instrText xml:space="preserve"> PAGEREF _Toc243267411 \h </w:instrText>
         </w:r>
         <w:r>
           <w:rPr>
@@ -5293,7 +5293,7 @@
           <w14:ligatures w14:val="standardContextual"/>
         </w:rPr>
       </w:pPr>
-      <w:hyperlink w:anchor="_Toc243264366" w:history="1">
+      <w:hyperlink w:anchor="_Toc243267412" w:history="1">
         <w:r>
           <w:rPr>
             <w:rStyle w:val="Collegamentoipertestuale"/>
@@ -5338,7 +5338,7 @@
             <w:noProof/>
             <w:webHidden/>
           </w:rPr>
-          <w:instrText xml:space="preserve"> PAGEREF _Toc243264366 \h </w:instrText>
+          <w:instrText xml:space="preserve"> PAGEREF _Toc243267412 \h </w:instrText>
         </w:r>
         <w:r>
           <w:rPr>
@@ -5384,7 +5384,7 @@
           <w14:ligatures w14:val="standardContextual"/>
         </w:rPr>
       </w:pPr>
-      <w:hyperlink w:anchor="_Toc243264367" w:history="1">
+      <w:hyperlink w:anchor="_Toc243267413" w:history="1">
         <w:r>
           <w:rPr>
             <w:rStyle w:val="Collegamentoipertestuale"/>
@@ -5432,7 +5432,7 @@
             <w:noProof/>
             <w:webHidden/>
           </w:rPr>
-          <w:instrText xml:space="preserve"> PAGEREF _Toc243264367 \h </w:instrText>
+          <w:instrText xml:space="preserve"> PAGEREF _Toc243267413 \h </w:instrText>
         </w:r>
         <w:r>
           <w:rPr>
@@ -5479,7 +5479,7 @@
           <w14:ligatures w14:val="standardContextual"/>
         </w:rPr>
       </w:pPr>
-      <w:hyperlink w:anchor="_Toc243264368" w:history="1">
+      <w:hyperlink w:anchor="_Toc243267414" w:history="1">
         <w:r>
           <w:rPr>
             <w:rStyle w:val="Collegamentoipertestuale"/>
@@ -5524,7 +5524,7 @@
             <w:noProof/>
             <w:webHidden/>
           </w:rPr>
-          <w:instrText xml:space="preserve"> PAGEREF _Toc243264368 \h </w:instrText>
+          <w:instrText xml:space="preserve"> PAGEREF _Toc243267414 \h </w:instrText>
         </w:r>
         <w:r>
           <w:rPr>
@@ -5571,7 +5571,7 @@
           <w14:ligatures w14:val="standardContextual"/>
         </w:rPr>
       </w:pPr>
-      <w:hyperlink w:anchor="_Toc243264369" w:history="1">
+      <w:hyperlink w:anchor="_Toc243267415" w:history="1">
         <w:r>
           <w:rPr>
             <w:rStyle w:val="Collegamentoipertestuale"/>
@@ -5616,7 +5616,7 @@
             <w:noProof/>
             <w:webHidden/>
           </w:rPr>
-          <w:instrText xml:space="preserve"> PAGEREF _Toc243264369 \h </w:instrText>
+          <w:instrText xml:space="preserve"> PAGEREF _Toc243267415 \h </w:instrText>
         </w:r>
         <w:r>
           <w:rPr>
@@ -5663,7 +5663,7 @@
           <w14:ligatures w14:val="standardContextual"/>
         </w:rPr>
       </w:pPr>
-      <w:hyperlink w:anchor="_Toc243264370" w:history="1">
+      <w:hyperlink w:anchor="_Toc243267416" w:history="1">
         <w:r>
           <w:rPr>
             <w:rStyle w:val="Collegamentoipertestuale"/>
@@ -5708,7 +5708,7 @@
             <w:noProof/>
             <w:webHidden/>
           </w:rPr>
-          <w:instrText xml:space="preserve"> PAGEREF _Toc243264370 \h </w:instrText>
+          <w:instrText xml:space="preserve"> PAGEREF _Toc243267416 \h </w:instrText>
         </w:r>
         <w:r>
           <w:rPr>
@@ -5755,7 +5755,7 @@
           <w14:ligatures w14:val="standardContextual"/>
         </w:rPr>
       </w:pPr>
-      <w:hyperlink w:anchor="_Toc243264371" w:history="1">
+      <w:hyperlink w:anchor="_Toc243267417" w:history="1">
         <w:r>
           <w:rPr>
             <w:rStyle w:val="Collegamentoipertestuale"/>
@@ -5800,7 +5800,7 @@
             <w:noProof/>
             <w:webHidden/>
           </w:rPr>
-          <w:instrText xml:space="preserve"> PAGEREF _Toc243264371 \h </w:instrText>
+          <w:instrText xml:space="preserve"> PAGEREF _Toc243267417 \h </w:instrText>
         </w:r>
         <w:r>
           <w:rPr>
@@ -5847,7 +5847,7 @@
           <w14:ligatures w14:val="standardContextual"/>
         </w:rPr>
       </w:pPr>
-      <w:hyperlink w:anchor="_Toc243264372" w:history="1">
+      <w:hyperlink w:anchor="_Toc243267418" w:history="1">
         <w:r>
           <w:rPr>
             <w:rStyle w:val="Collegamentoipertestuale"/>
@@ -5892,7 +5892,7 @@
             <w:noProof/>
             <w:webHidden/>
           </w:rPr>
-          <w:instrText xml:space="preserve"> PAGEREF _Toc243264372 \h </w:instrText>
+          <w:instrText xml:space="preserve"> PAGEREF _Toc243267418 \h </w:instrText>
         </w:r>
         <w:r>
           <w:rPr>
@@ -5938,7 +5938,7 @@
           <w14:ligatures w14:val="standardContextual"/>
         </w:rPr>
       </w:pPr>
-      <w:hyperlink w:anchor="_Toc243264373" w:history="1">
+      <w:hyperlink w:anchor="_Toc243267419" w:history="1">
         <w:r>
           <w:rPr>
             <w:rStyle w:val="Collegamentoipertestuale"/>
@@ -5986,7 +5986,7 @@
             <w:noProof/>
             <w:webHidden/>
           </w:rPr>
-          <w:instrText xml:space="preserve"> PAGEREF _Toc243264373 \h </w:instrText>
+          <w:instrText xml:space="preserve"> PAGEREF _Toc243267419 \h </w:instrText>
         </w:r>
         <w:r>
           <w:rPr>
@@ -6033,7 +6033,7 @@
           <w14:ligatures w14:val="standardContextual"/>
         </w:rPr>
       </w:pPr>
-      <w:hyperlink w:anchor="_Toc243264374" w:history="1">
+      <w:hyperlink w:anchor="_Toc243267420" w:history="1">
         <w:r>
           <w:rPr>
             <w:rStyle w:val="Collegamentoipertestuale"/>
@@ -6078,7 +6078,7 @@
             <w:noProof/>
             <w:webHidden/>
           </w:rPr>
-          <w:instrText xml:space="preserve"> PAGEREF _Toc243264374 \h </w:instrText>
+          <w:instrText xml:space="preserve"> PAGEREF _Toc243267420 \h </w:instrText>
         </w:r>
         <w:r>
           <w:rPr>
@@ -6125,7 +6125,7 @@
           <w14:ligatures w14:val="standardContextual"/>
         </w:rPr>
       </w:pPr>
-      <w:hyperlink w:anchor="_Toc243264375" w:history="1">
+      <w:hyperlink w:anchor="_Toc243267421" w:history="1">
         <w:r>
           <w:rPr>
             <w:rStyle w:val="Collegamentoipertestuale"/>
@@ -6170,7 +6170,7 @@
             <w:noProof/>
             <w:webHidden/>
           </w:rPr>
-          <w:instrText xml:space="preserve"> PAGEREF _Toc243264375 \h </w:instrText>
+          <w:instrText xml:space="preserve"> PAGEREF _Toc243267421 \h </w:instrText>
         </w:r>
         <w:r>
           <w:rPr>
@@ -6217,7 +6217,7 @@
           <w14:ligatures w14:val="standardContextual"/>
         </w:rPr>
       </w:pPr>
-      <w:hyperlink w:anchor="_Toc243264376" w:history="1">
+      <w:hyperlink w:anchor="_Toc243267422" w:history="1">
         <w:r>
           <w:rPr>
             <w:rStyle w:val="Collegamentoipertestuale"/>
@@ -6262,7 +6262,7 @@
             <w:noProof/>
             <w:webHidden/>
           </w:rPr>
-          <w:instrText xml:space="preserve"> PAGEREF _Toc243264376 \h </w:instrText>
+          <w:instrText xml:space="preserve"> PAGEREF _Toc243267422 \h </w:instrText>
         </w:r>
         <w:r>
           <w:rPr>
@@ -6309,7 +6309,7 @@
           <w14:ligatures w14:val="standardContextual"/>
         </w:rPr>
       </w:pPr>
-      <w:hyperlink w:anchor="_Toc243264377" w:history="1">
+      <w:hyperlink w:anchor="_Toc243267423" w:history="1">
         <w:r>
           <w:rPr>
             <w:rStyle w:val="Collegamentoipertestuale"/>
@@ -6354,7 +6354,7 @@
             <w:noProof/>
             <w:webHidden/>
           </w:rPr>
-          <w:instrText xml:space="preserve"> PAGEREF _Toc243264377 \h </w:instrText>
+          <w:instrText xml:space="preserve"> PAGEREF _Toc243267423 \h </w:instrText>
         </w:r>
         <w:r>
           <w:rPr>
@@ -6401,7 +6401,7 @@
           <w14:ligatures w14:val="standardContextual"/>
         </w:rPr>
       </w:pPr>
-      <w:hyperlink w:anchor="_Toc243264378" w:history="1">
+      <w:hyperlink w:anchor="_Toc243267424" w:history="1">
         <w:r>
           <w:rPr>
             <w:rStyle w:val="Collegamentoipertestuale"/>
@@ -6446,7 +6446,7 @@
             <w:noProof/>
             <w:webHidden/>
           </w:rPr>
-          <w:instrText xml:space="preserve"> PAGEREF _Toc243264378 \h </w:instrText>
+          <w:instrText xml:space="preserve"> PAGEREF _Toc243267424 \h </w:instrText>
         </w:r>
         <w:r>
           <w:rPr>
@@ -6493,7 +6493,7 @@
           <w14:ligatures w14:val="standardContextual"/>
         </w:rPr>
       </w:pPr>
-      <w:hyperlink w:anchor="_Toc243264379" w:history="1">
+      <w:hyperlink w:anchor="_Toc243267425" w:history="1">
         <w:r>
           <w:rPr>
             <w:rStyle w:val="Collegamentoipertestuale"/>
@@ -6538,7 +6538,7 @@
             <w:noProof/>
             <w:webHidden/>
           </w:rPr>
-          <w:instrText xml:space="preserve"> PAGEREF _Toc243264379 \h </w:instrText>
+          <w:instrText xml:space="preserve"> PAGEREF _Toc243267425 \h </w:instrText>
         </w:r>
         <w:r>
           <w:rPr>
@@ -6585,7 +6585,7 @@
           <w14:ligatures w14:val="standardContextual"/>
         </w:rPr>
       </w:pPr>
-      <w:hyperlink w:anchor="_Toc243264380" w:history="1">
+      <w:hyperlink w:anchor="_Toc243267426" w:history="1">
         <w:r>
           <w:rPr>
             <w:rStyle w:val="Collegamentoipertestuale"/>
@@ -6630,7 +6630,7 @@
             <w:noProof/>
             <w:webHidden/>
           </w:rPr>
-          <w:instrText xml:space="preserve"> PAGEREF _Toc243264380 \h </w:instrText>
+          <w:instrText xml:space="preserve"> PAGEREF _Toc243267426 \h </w:instrText>
         </w:r>
         <w:r>
           <w:rPr>
@@ -6677,7 +6677,7 @@
           <w14:ligatures w14:val="standardContextual"/>
         </w:rPr>
       </w:pPr>
-      <w:hyperlink w:anchor="_Toc243264381" w:history="1">
+      <w:hyperlink w:anchor="_Toc243267427" w:history="1">
         <w:r>
           <w:rPr>
             <w:rStyle w:val="Collegamentoipertestuale"/>
@@ -6722,7 +6722,7 @@
             <w:noProof/>
             <w:webHidden/>
           </w:rPr>
-          <w:instrText xml:space="preserve"> PAGEREF _Toc243264381 \h </w:instrText>
+          <w:instrText xml:space="preserve"> PAGEREF _Toc243267427 \h </w:instrText>
         </w:r>
         <w:r>
           <w:rPr>
@@ -6769,7 +6769,7 @@
           <w14:ligatures w14:val="standardContextual"/>
         </w:rPr>
       </w:pPr>
-      <w:hyperlink w:anchor="_Toc243264382" w:history="1">
+      <w:hyperlink w:anchor="_Toc243267428" w:history="1">
         <w:r>
           <w:rPr>
             <w:rStyle w:val="Collegamentoipertestuale"/>
@@ -6814,7 +6814,7 @@
             <w:noProof/>
             <w:webHidden/>
           </w:rPr>
-          <w:instrText xml:space="preserve"> PAGEREF _Toc243264382 \h </w:instrText>
+          <w:instrText xml:space="preserve"> PAGEREF _Toc243267428 \h </w:instrText>
         </w:r>
         <w:r>
           <w:rPr>
@@ -6860,7 +6860,7 @@
           <w14:ligatures w14:val="standardContextual"/>
         </w:rPr>
       </w:pPr>
-      <w:hyperlink w:anchor="_Toc243264383" w:history="1">
+      <w:hyperlink w:anchor="_Toc243267429" w:history="1">
         <w:r>
           <w:rPr>
             <w:rStyle w:val="Collegamentoipertestuale"/>
@@ -6908,7 +6908,7 @@
             <w:noProof/>
             <w:webHidden/>
           </w:rPr>
-          <w:instrText xml:space="preserve"> PAGEREF _Toc243264383 \h </w:instrText>
+          <w:instrText xml:space="preserve"> PAGEREF _Toc243267429 \h </w:instrText>
         </w:r>
         <w:r>
           <w:rPr>
@@ -6955,7 +6955,7 @@
           <w14:ligatures w14:val="standardContextual"/>
         </w:rPr>
       </w:pPr>
-      <w:hyperlink w:anchor="_Toc243264384" w:history="1">
+      <w:hyperlink w:anchor="_Toc243267430" w:history="1">
         <w:r>
           <w:rPr>
             <w:rStyle w:val="Collegamentoipertestuale"/>
@@ -7000,7 +7000,7 @@
             <w:noProof/>
             <w:webHidden/>
           </w:rPr>
-          <w:instrText xml:space="preserve"> PAGEREF _Toc243264384 \h </w:instrText>
+          <w:instrText xml:space="preserve"> PAGEREF _Toc243267430 \h </w:instrText>
         </w:r>
         <w:r>
           <w:rPr>
@@ -7047,7 +7047,7 @@
           <w14:ligatures w14:val="standardContextual"/>
         </w:rPr>
       </w:pPr>
-      <w:hyperlink w:anchor="_Toc243264385" w:history="1">
+      <w:hyperlink w:anchor="_Toc243267431" w:history="1">
         <w:r>
           <w:rPr>
             <w:rStyle w:val="Collegamentoipertestuale"/>
@@ -7092,7 +7092,7 @@
             <w:noProof/>
             <w:webHidden/>
           </w:rPr>
-          <w:instrText xml:space="preserve"> PAGEREF _Toc243264385 \h </w:instrText>
+          <w:instrText xml:space="preserve"> PAGEREF _Toc243267431 \h </w:instrText>
         </w:r>
         <w:r>
           <w:rPr>
@@ -7139,7 +7139,7 @@
           <w14:ligatures w14:val="standardContextual"/>
         </w:rPr>
       </w:pPr>
-      <w:hyperlink w:anchor="_Toc243264386" w:history="1">
+      <w:hyperlink w:anchor="_Toc243267432" w:history="1">
         <w:r>
           <w:rPr>
             <w:rStyle w:val="Collegamentoipertestuale"/>
@@ -7184,7 +7184,7 @@
             <w:noProof/>
             <w:webHidden/>
           </w:rPr>
-          <w:instrText xml:space="preserve"> PAGEREF _Toc243264386 \h </w:instrText>
+          <w:instrText xml:space="preserve"> PAGEREF _Toc243267432 \h </w:instrText>
         </w:r>
         <w:r>
           <w:rPr>
@@ -7231,7 +7231,7 @@
           <w14:ligatures w14:val="standardContextual"/>
         </w:rPr>
       </w:pPr>
-      <w:hyperlink w:anchor="_Toc243264387" w:history="1">
+      <w:hyperlink w:anchor="_Toc243267433" w:history="1">
         <w:r>
           <w:rPr>
             <w:rStyle w:val="Collegamentoipertestuale"/>
@@ -7276,7 +7276,7 @@
             <w:noProof/>
             <w:webHidden/>
           </w:rPr>
-          <w:instrText xml:space="preserve"> PAGEREF _Toc243264387 \h </w:instrText>
+          <w:instrText xml:space="preserve"> PAGEREF _Toc243267433 \h </w:instrText>
         </w:r>
         <w:r>
           <w:rPr>
@@ -7323,7 +7323,7 @@
           <w14:ligatures w14:val="standardContextual"/>
         </w:rPr>
       </w:pPr>
-      <w:hyperlink w:anchor="_Toc243264388" w:history="1">
+      <w:hyperlink w:anchor="_Toc243267434" w:history="1">
         <w:r>
           <w:rPr>
             <w:rStyle w:val="Collegamentoipertestuale"/>
@@ -7368,7 +7368,7 @@
             <w:noProof/>
             <w:webHidden/>
           </w:rPr>
-          <w:instrText xml:space="preserve"> PAGEREF _Toc243264388 \h </w:instrText>
+          <w:instrText xml:space="preserve"> PAGEREF _Toc243267434 \h </w:instrText>
         </w:r>
         <w:r>
           <w:rPr>
@@ -7415,7 +7415,7 @@
           <w14:ligatures w14:val="standardContextual"/>
         </w:rPr>
       </w:pPr>
-      <w:hyperlink w:anchor="_Toc243264389" w:history="1">
+      <w:hyperlink w:anchor="_Toc243267435" w:history="1">
         <w:r>
           <w:rPr>
             <w:rStyle w:val="Collegamentoipertestuale"/>
@@ -7460,7 +7460,7 @@
             <w:noProof/>
             <w:webHidden/>
           </w:rPr>
-          <w:instrText xml:space="preserve"> PAGEREF _Toc243264389 \h </w:instrText>
+          <w:instrText xml:space="preserve"> PAGEREF _Toc243267435 \h </w:instrText>
         </w:r>
         <w:r>
           <w:rPr>
@@ -7507,7 +7507,7 @@
           <w14:ligatures w14:val="standardContextual"/>
         </w:rPr>
       </w:pPr>
-      <w:hyperlink w:anchor="_Toc243264390" w:history="1">
+      <w:hyperlink w:anchor="_Toc243267436" w:history="1">
         <w:r>
           <w:rPr>
             <w:rStyle w:val="Collegamentoipertestuale"/>
@@ -7552,7 +7552,7 @@
             <w:noProof/>
             <w:webHidden/>
           </w:rPr>
-          <w:instrText xml:space="preserve"> PAGEREF _Toc243264390 \h </w:instrText>
+          <w:instrText xml:space="preserve"> PAGEREF _Toc243267436 \h </w:instrText>
         </w:r>
         <w:r>
           <w:rPr>
@@ -7599,7 +7599,7 @@
           <w14:ligatures w14:val="standardContextual"/>
         </w:rPr>
       </w:pPr>
-      <w:hyperlink w:anchor="_Toc243264391" w:history="1">
+      <w:hyperlink w:anchor="_Toc243267437" w:history="1">
         <w:r>
           <w:rPr>
             <w:rStyle w:val="Collegamentoipertestuale"/>
@@ -7644,7 +7644,7 @@
             <w:noProof/>
             <w:webHidden/>
           </w:rPr>
-          <w:instrText xml:space="preserve"> PAGEREF _Toc243264391 \h </w:instrText>
+          <w:instrText xml:space="preserve"> PAGEREF _Toc243267437 \h </w:instrText>
         </w:r>
         <w:r>
           <w:rPr>
@@ -7691,7 +7691,7 @@
           <w14:ligatures w14:val="standardContextual"/>
         </w:rPr>
       </w:pPr>
-      <w:hyperlink w:anchor="_Toc243264392" w:history="1">
+      <w:hyperlink w:anchor="_Toc243267438" w:history="1">
         <w:r>
           <w:rPr>
             <w:rStyle w:val="Collegamentoipertestuale"/>
@@ -7736,7 +7736,7 @@
             <w:noProof/>
             <w:webHidden/>
           </w:rPr>
-          <w:instrText xml:space="preserve"> PAGEREF _Toc243264392 \h </w:instrText>
+          <w:instrText xml:space="preserve"> PAGEREF _Toc243267438 \h </w:instrText>
         </w:r>
         <w:r>
           <w:rPr>
@@ -7783,7 +7783,7 @@
           <w14:ligatures w14:val="standardContextual"/>
         </w:rPr>
       </w:pPr>
-      <w:hyperlink w:anchor="_Toc243264393" w:history="1">
+      <w:hyperlink w:anchor="_Toc243267439" w:history="1">
         <w:r>
           <w:rPr>
             <w:rStyle w:val="Collegamentoipertestuale"/>
@@ -7828,7 +7828,7 @@
             <w:noProof/>
             <w:webHidden/>
           </w:rPr>
-          <w:instrText xml:space="preserve"> PAGEREF _Toc243264393 \h </w:instrText>
+          <w:instrText xml:space="preserve"> PAGEREF _Toc243267439 \h </w:instrText>
         </w:r>
         <w:r>
           <w:rPr>
@@ -7875,7 +7875,7 @@
           <w14:ligatures w14:val="standardContextual"/>
         </w:rPr>
       </w:pPr>
-      <w:hyperlink w:anchor="_Toc243264394" w:history="1">
+      <w:hyperlink w:anchor="_Toc243267440" w:history="1">
         <w:r>
           <w:rPr>
             <w:rStyle w:val="Collegamentoipertestuale"/>
@@ -7920,7 +7920,7 @@
             <w:noProof/>
             <w:webHidden/>
           </w:rPr>
-          <w:instrText xml:space="preserve"> PAGEREF _Toc243264394 \h </w:instrText>
+          <w:instrText xml:space="preserve"> PAGEREF _Toc243267440 \h </w:instrText>
         </w:r>
         <w:r>
           <w:rPr>
@@ -7967,7 +7967,7 @@
           <w14:ligatures w14:val="standardContextual"/>
         </w:rPr>
       </w:pPr>
-      <w:hyperlink w:anchor="_Toc243264395" w:history="1">
+      <w:hyperlink w:anchor="_Toc243267441" w:history="1">
         <w:r>
           <w:rPr>
             <w:rStyle w:val="Collegamentoipertestuale"/>
@@ -8012,7 +8012,7 @@
             <w:noProof/>
             <w:webHidden/>
           </w:rPr>
-          <w:instrText xml:space="preserve"> PAGEREF _Toc243264395 \h </w:instrText>
+          <w:instrText xml:space="preserve"> PAGEREF _Toc243267441 \h </w:instrText>
         </w:r>
         <w:r>
           <w:rPr>
@@ -8059,7 +8059,7 @@
           <w14:ligatures w14:val="standardContextual"/>
         </w:rPr>
       </w:pPr>
-      <w:hyperlink w:anchor="_Toc243264396" w:history="1">
+      <w:hyperlink w:anchor="_Toc243267442" w:history="1">
         <w:r>
           <w:rPr>
             <w:rStyle w:val="Collegamentoipertestuale"/>
@@ -8104,7 +8104,7 @@
             <w:noProof/>
             <w:webHidden/>
           </w:rPr>
-          <w:instrText xml:space="preserve"> PAGEREF _Toc243264396 \h </w:instrText>
+          <w:instrText xml:space="preserve"> PAGEREF _Toc243267442 \h </w:instrText>
         </w:r>
         <w:r>
           <w:rPr>
@@ -8151,7 +8151,7 @@
           <w14:ligatures w14:val="standardContextual"/>
         </w:rPr>
       </w:pPr>
-      <w:hyperlink w:anchor="_Toc243264397" w:history="1">
+      <w:hyperlink w:anchor="_Toc243267443" w:history="1">
         <w:r>
           <w:rPr>
             <w:rStyle w:val="Collegamentoipertestuale"/>
@@ -8196,7 +8196,7 @@
             <w:noProof/>
             <w:webHidden/>
           </w:rPr>
-          <w:instrText xml:space="preserve"> PAGEREF _Toc243264397 \h </w:instrText>
+          <w:instrText xml:space="preserve"> PAGEREF _Toc243267443 \h </w:instrText>
         </w:r>
         <w:r>
           <w:rPr>
@@ -8243,7 +8243,7 @@
           <w14:ligatures w14:val="standardContextual"/>
         </w:rPr>
       </w:pPr>
-      <w:hyperlink w:anchor="_Toc243264398" w:history="1">
+      <w:hyperlink w:anchor="_Toc243267444" w:history="1">
         <w:r>
           <w:rPr>
             <w:rStyle w:val="Collegamentoipertestuale"/>
@@ -8288,7 +8288,7 @@
             <w:noProof/>
             <w:webHidden/>
           </w:rPr>
-          <w:instrText xml:space="preserve"> PAGEREF _Toc243264398 \h </w:instrText>
+          <w:instrText xml:space="preserve"> PAGEREF _Toc243267444 \h </w:instrText>
         </w:r>
         <w:r>
           <w:rPr>
@@ -8335,7 +8335,7 @@
           <w14:ligatures w14:val="standardContextual"/>
         </w:rPr>
       </w:pPr>
-      <w:hyperlink w:anchor="_Toc243264399" w:history="1">
+      <w:hyperlink w:anchor="_Toc243267445" w:history="1">
         <w:r>
           <w:rPr>
             <w:rStyle w:val="Collegamentoipertestuale"/>
@@ -8380,7 +8380,7 @@
             <w:noProof/>
             <w:webHidden/>
           </w:rPr>
-          <w:instrText xml:space="preserve"> PAGEREF _Toc243264399 \h </w:instrText>
+          <w:instrText xml:space="preserve"> PAGEREF _Toc243267445 \h </w:instrText>
         </w:r>
         <w:r>
           <w:rPr>
@@ -8426,7 +8426,7 @@
           <w14:ligatures w14:val="standardContextual"/>
         </w:rPr>
       </w:pPr>
-      <w:hyperlink w:anchor="_Toc243264400" w:history="1">
+      <w:hyperlink w:anchor="_Toc243267446" w:history="1">
         <w:r>
           <w:rPr>
             <w:rStyle w:val="Collegamentoipertestuale"/>
@@ -8474,7 +8474,7 @@
             <w:noProof/>
             <w:webHidden/>
           </w:rPr>
-          <w:instrText xml:space="preserve"> PAGEREF _Toc243264400 \h </w:instrText>
+          <w:instrText xml:space="preserve"> PAGEREF _Toc243267446 \h </w:instrText>
         </w:r>
         <w:r>
           <w:rPr>
@@ -8521,7 +8521,7 @@
           <w14:ligatures w14:val="standardContextual"/>
         </w:rPr>
       </w:pPr>
-      <w:hyperlink w:anchor="_Toc243264401" w:history="1">
+      <w:hyperlink w:anchor="_Toc243267447" w:history="1">
         <w:r>
           <w:rPr>
             <w:rStyle w:val="Collegamentoipertestuale"/>
@@ -8566,7 +8566,7 @@
             <w:noProof/>
             <w:webHidden/>
           </w:rPr>
-          <w:instrText xml:space="preserve"> PAGEREF _Toc243264401 \h </w:instrText>
+          <w:instrText xml:space="preserve"> PAGEREF _Toc243267447 \h </w:instrText>
         </w:r>
         <w:r>
           <w:rPr>
@@ -8613,7 +8613,7 @@
           <w14:ligatures w14:val="standardContextual"/>
         </w:rPr>
       </w:pPr>
-      <w:hyperlink w:anchor="_Toc243264402" w:history="1">
+      <w:hyperlink w:anchor="_Toc243267448" w:history="1">
         <w:r>
           <w:rPr>
             <w:rStyle w:val="Collegamentoipertestuale"/>
@@ -8658,7 +8658,7 @@
             <w:noProof/>
             <w:webHidden/>
           </w:rPr>
-          <w:instrText xml:space="preserve"> PAGEREF _Toc243264402 \h </w:instrText>
+          <w:instrText xml:space="preserve"> PAGEREF _Toc243267448 \h </w:instrText>
         </w:r>
         <w:r>
           <w:rPr>
@@ -8705,7 +8705,7 @@
           <w14:ligatures w14:val="standardContextual"/>
         </w:rPr>
       </w:pPr>
-      <w:hyperlink w:anchor="_Toc243264403" w:history="1">
+      <w:hyperlink w:anchor="_Toc243267449" w:history="1">
         <w:r>
           <w:rPr>
             <w:rStyle w:val="Collegamentoipertestuale"/>
@@ -8750,7 +8750,7 @@
             <w:noProof/>
             <w:webHidden/>
           </w:rPr>
-          <w:instrText xml:space="preserve"> PAGEREF _Toc243264403 \h </w:instrText>
+          <w:instrText xml:space="preserve"> PAGEREF _Toc243267449 \h </w:instrText>
         </w:r>
         <w:r>
           <w:rPr>
@@ -8797,7 +8797,7 @@
           <w14:ligatures w14:val="standardContextual"/>
         </w:rPr>
       </w:pPr>
-      <w:hyperlink w:anchor="_Toc243264404" w:history="1">
+      <w:hyperlink w:anchor="_Toc243267450" w:history="1">
         <w:r>
           <w:rPr>
             <w:rStyle w:val="Collegamentoipertestuale"/>
@@ -8842,7 +8842,7 @@
             <w:noProof/>
             <w:webHidden/>
           </w:rPr>
-          <w:instrText xml:space="preserve"> PAGEREF _Toc243264404 \h </w:instrText>
+          <w:instrText xml:space="preserve"> PAGEREF _Toc243267450 \h </w:instrText>
         </w:r>
         <w:r>
           <w:rPr>
@@ -8888,7 +8888,7 @@
           <w14:ligatures w14:val="standardContextual"/>
         </w:rPr>
       </w:pPr>
-      <w:hyperlink w:anchor="_Toc243264405" w:history="1">
+      <w:hyperlink w:anchor="_Toc243267451" w:history="1">
         <w:r>
           <w:rPr>
             <w:rStyle w:val="Collegamentoipertestuale"/>
@@ -8936,7 +8936,7 @@
             <w:noProof/>
             <w:webHidden/>
           </w:rPr>
-          <w:instrText xml:space="preserve"> PAGEREF _Toc243264405 \h </w:instrText>
+          <w:instrText xml:space="preserve"> PAGEREF _Toc243267451 \h </w:instrText>
         </w:r>
         <w:r>
           <w:rPr>
@@ -8982,7 +8982,7 @@
           <w14:ligatures w14:val="standardContextual"/>
         </w:rPr>
       </w:pPr>
-      <w:hyperlink w:anchor="_Toc243264406" w:history="1">
+      <w:hyperlink w:anchor="_Toc243267452" w:history="1">
         <w:r>
           <w:rPr>
             <w:rStyle w:val="Collegamentoipertestuale"/>
@@ -9030,7 +9030,7 @@
             <w:noProof/>
             <w:webHidden/>
           </w:rPr>
-          <w:instrText xml:space="preserve"> PAGEREF _Toc243264406 \h </w:instrText>
+          <w:instrText xml:space="preserve"> PAGEREF _Toc243267452 \h </w:instrText>
         </w:r>
         <w:r>
           <w:rPr>
@@ -9077,7 +9077,7 @@
           <w14:ligatures w14:val="standardContextual"/>
         </w:rPr>
       </w:pPr>
-      <w:hyperlink w:anchor="_Toc243264407" w:history="1">
+      <w:hyperlink w:anchor="_Toc243267453" w:history="1">
         <w:r>
           <w:rPr>
             <w:rStyle w:val="Collegamentoipertestuale"/>
@@ -9122,7 +9122,7 @@
             <w:noProof/>
             <w:webHidden/>
           </w:rPr>
-          <w:instrText xml:space="preserve"> PAGEREF _Toc243264407 \h </w:instrText>
+          <w:instrText xml:space="preserve"> PAGEREF _Toc243267453 \h </w:instrText>
         </w:r>
         <w:r>
           <w:rPr>
@@ -9168,7 +9168,7 @@
           <w14:ligatures w14:val="standardContextual"/>
         </w:rPr>
       </w:pPr>
-      <w:hyperlink w:anchor="_Toc243264408" w:history="1">
+      <w:hyperlink w:anchor="_Toc243267454" w:history="1">
         <w:r>
           <w:rPr>
             <w:rStyle w:val="Collegamentoipertestuale"/>
@@ -9216,7 +9216,7 @@
             <w:noProof/>
             <w:webHidden/>
           </w:rPr>
-          <w:instrText xml:space="preserve"> PAGEREF _Toc243264408 \h </w:instrText>
+          <w:instrText xml:space="preserve"> PAGEREF _Toc243267454 \h </w:instrText>
         </w:r>
         <w:r>
           <w:rPr>
@@ -9263,7 +9263,7 @@
           <w14:ligatures w14:val="standardContextual"/>
         </w:rPr>
       </w:pPr>
-      <w:hyperlink w:anchor="_Toc243264409" w:history="1">
+      <w:hyperlink w:anchor="_Toc243267455" w:history="1">
         <w:r>
           <w:rPr>
             <w:rStyle w:val="Collegamentoipertestuale"/>
@@ -9308,7 +9308,7 @@
             <w:noProof/>
             <w:webHidden/>
           </w:rPr>
-          <w:instrText xml:space="preserve"> PAGEREF _Toc243264409 \h </w:instrText>
+          <w:instrText xml:space="preserve"> PAGEREF _Toc243267455 \h </w:instrText>
         </w:r>
         <w:r>
           <w:rPr>
@@ -9355,7 +9355,7 @@
           <w14:ligatures w14:val="standardContextual"/>
         </w:rPr>
       </w:pPr>
-      <w:hyperlink w:anchor="_Toc243264410" w:history="1">
+      <w:hyperlink w:anchor="_Toc243267456" w:history="1">
         <w:r>
           <w:rPr>
             <w:rStyle w:val="Collegamentoipertestuale"/>
@@ -9400,7 +9400,7 @@
             <w:noProof/>
             <w:webHidden/>
           </w:rPr>
-          <w:instrText xml:space="preserve"> PAGEREF _Toc243264410 \h </w:instrText>
+          <w:instrText xml:space="preserve"> PAGEREF _Toc243267456 \h </w:instrText>
         </w:r>
         <w:r>
           <w:rPr>
@@ -9447,7 +9447,7 @@
           <w14:ligatures w14:val="standardContextual"/>
         </w:rPr>
       </w:pPr>
-      <w:hyperlink w:anchor="_Toc243264411" w:history="1">
+      <w:hyperlink w:anchor="_Toc243267457" w:history="1">
         <w:r>
           <w:rPr>
             <w:rStyle w:val="Collegamentoipertestuale"/>
@@ -9492,7 +9492,7 @@
             <w:noProof/>
             <w:webHidden/>
           </w:rPr>
-          <w:instrText xml:space="preserve"> PAGEREF _Toc243264411 \h </w:instrText>
+          <w:instrText xml:space="preserve"> PAGEREF _Toc243267457 \h </w:instrText>
         </w:r>
         <w:r>
           <w:rPr>
@@ -9539,7 +9539,7 @@
           <w14:ligatures w14:val="standardContextual"/>
         </w:rPr>
       </w:pPr>
-      <w:hyperlink w:anchor="_Toc243264412" w:history="1">
+      <w:hyperlink w:anchor="_Toc243267458" w:history="1">
         <w:r>
           <w:rPr>
             <w:rStyle w:val="Collegamentoipertestuale"/>
@@ -9584,7 +9584,7 @@
             <w:noProof/>
             <w:webHidden/>
           </w:rPr>
-          <w:instrText xml:space="preserve"> PAGEREF _Toc243264412 \h </w:instrText>
+          <w:instrText xml:space="preserve"> PAGEREF _Toc243267458 \h </w:instrText>
         </w:r>
         <w:r>
           <w:rPr>
@@ -9631,7 +9631,7 @@
           <w14:ligatures w14:val="standardContextual"/>
         </w:rPr>
       </w:pPr>
-      <w:hyperlink w:anchor="_Toc243264413" w:history="1">
+      <w:hyperlink w:anchor="_Toc243267459" w:history="1">
         <w:r>
           <w:rPr>
             <w:rStyle w:val="Collegamentoipertestuale"/>
@@ -9676,7 +9676,7 @@
             <w:noProof/>
             <w:webHidden/>
           </w:rPr>
-          <w:instrText xml:space="preserve"> PAGEREF _Toc243264413 \h </w:instrText>
+          <w:instrText xml:space="preserve"> PAGEREF _Toc243267459 \h </w:instrText>
         </w:r>
         <w:r>
           <w:rPr>
@@ -9723,7 +9723,7 @@
           <w14:ligatures w14:val="standardContextual"/>
         </w:rPr>
       </w:pPr>
-      <w:hyperlink w:anchor="_Toc243264414" w:history="1">
+      <w:hyperlink w:anchor="_Toc243267460" w:history="1">
         <w:r>
           <w:rPr>
             <w:rStyle w:val="Collegamentoipertestuale"/>
@@ -9768,7 +9768,7 @@
             <w:noProof/>
             <w:webHidden/>
           </w:rPr>
-          <w:instrText xml:space="preserve"> PAGEREF _Toc243264414 \h </w:instrText>
+          <w:instrText xml:space="preserve"> PAGEREF _Toc243267460 \h </w:instrText>
         </w:r>
         <w:r>
           <w:rPr>
@@ -9814,7 +9814,7 @@
           <w14:ligatures w14:val="standardContextual"/>
         </w:rPr>
       </w:pPr>
-      <w:hyperlink w:anchor="_Toc243264415" w:history="1">
+      <w:hyperlink w:anchor="_Toc243267461" w:history="1">
         <w:r>
           <w:rPr>
             <w:rStyle w:val="Collegamentoipertestuale"/>
@@ -9862,7 +9862,7 @@
             <w:noProof/>
             <w:webHidden/>
           </w:rPr>
-          <w:instrText xml:space="preserve"> PAGEREF _Toc243264415 \h </w:instrText>
+          <w:instrText xml:space="preserve"> PAGEREF _Toc243267461 \h </w:instrText>
         </w:r>
         <w:r>
           <w:rPr>
@@ -9909,7 +9909,7 @@
           <w14:ligatures w14:val="standardContextual"/>
         </w:rPr>
       </w:pPr>
-      <w:hyperlink w:anchor="_Toc243264416" w:history="1">
+      <w:hyperlink w:anchor="_Toc243267462" w:history="1">
         <w:r>
           <w:rPr>
             <w:rStyle w:val="Collegamentoipertestuale"/>
@@ -9954,7 +9954,7 @@
             <w:noProof/>
             <w:webHidden/>
           </w:rPr>
-          <w:instrText xml:space="preserve"> PAGEREF _Toc243264416 \h </w:instrText>
+          <w:instrText xml:space="preserve"> PAGEREF _Toc243267462 \h </w:instrText>
         </w:r>
         <w:r>
           <w:rPr>
@@ -10001,7 +10001,7 @@
           <w14:ligatures w14:val="standardContextual"/>
         </w:rPr>
       </w:pPr>
-      <w:hyperlink w:anchor="_Toc243264417" w:history="1">
+      <w:hyperlink w:anchor="_Toc243267463" w:history="1">
         <w:r>
           <w:rPr>
             <w:rStyle w:val="Collegamentoipertestuale"/>
@@ -10046,7 +10046,7 @@
             <w:noProof/>
             <w:webHidden/>
           </w:rPr>
-          <w:instrText xml:space="preserve"> PAGEREF _Toc243264417 \h </w:instrText>
+          <w:instrText xml:space="preserve"> PAGEREF _Toc243267463 \h </w:instrText>
         </w:r>
         <w:r>
           <w:rPr>
@@ -10093,7 +10093,7 @@
           <w14:ligatures w14:val="standardContextual"/>
         </w:rPr>
       </w:pPr>
-      <w:hyperlink w:anchor="_Toc243264418" w:history="1">
+      <w:hyperlink w:anchor="_Toc243267464" w:history="1">
         <w:r>
           <w:rPr>
             <w:rStyle w:val="Collegamentoipertestuale"/>
@@ -10138,7 +10138,7 @@
             <w:noProof/>
             <w:webHidden/>
           </w:rPr>
-          <w:instrText xml:space="preserve"> PAGEREF _Toc243264418 \h </w:instrText>
+          <w:instrText xml:space="preserve"> PAGEREF _Toc243267464 \h </w:instrText>
         </w:r>
         <w:r>
           <w:rPr>
@@ -10185,7 +10185,7 @@
           <w14:ligatures w14:val="standardContextual"/>
         </w:rPr>
       </w:pPr>
-      <w:hyperlink w:anchor="_Toc243264419" w:history="1">
+      <w:hyperlink w:anchor="_Toc243267465" w:history="1">
         <w:r>
           <w:rPr>
             <w:rStyle w:val="Collegamentoipertestuale"/>
@@ -10230,7 +10230,7 @@
             <w:noProof/>
             <w:webHidden/>
           </w:rPr>
-          <w:instrText xml:space="preserve"> PAGEREF _Toc243264419 \h </w:instrText>
+          <w:instrText xml:space="preserve"> PAGEREF _Toc243267465 \h </w:instrText>
         </w:r>
         <w:r>
           <w:rPr>
@@ -10277,7 +10277,7 @@
           <w14:ligatures w14:val="standardContextual"/>
         </w:rPr>
       </w:pPr>
-      <w:hyperlink w:anchor="_Toc243264420" w:history="1">
+      <w:hyperlink w:anchor="_Toc243267466" w:history="1">
         <w:r>
           <w:rPr>
             <w:rStyle w:val="Collegamentoipertestuale"/>
@@ -10322,7 +10322,7 @@
             <w:noProof/>
             <w:webHidden/>
           </w:rPr>
-          <w:instrText xml:space="preserve"> PAGEREF _Toc243264420 \h </w:instrText>
+          <w:instrText xml:space="preserve"> PAGEREF _Toc243267466 \h </w:instrText>
         </w:r>
         <w:r>
           <w:rPr>
@@ -10369,7 +10369,7 @@
           <w14:ligatures w14:val="standardContextual"/>
         </w:rPr>
       </w:pPr>
-      <w:hyperlink w:anchor="_Toc243264421" w:history="1">
+      <w:hyperlink w:anchor="_Toc243267467" w:history="1">
         <w:r>
           <w:rPr>
             <w:rStyle w:val="Collegamentoipertestuale"/>
@@ -10414,7 +10414,7 @@
             <w:noProof/>
             <w:webHidden/>
           </w:rPr>
-          <w:instrText xml:space="preserve"> PAGEREF _Toc243264421 \h </w:instrText>
+          <w:instrText xml:space="preserve"> PAGEREF _Toc243267467 \h </w:instrText>
         </w:r>
         <w:r>
           <w:rPr>
@@ -10461,7 +10461,7 @@
           <w14:ligatures w14:val="standardContextual"/>
         </w:rPr>
       </w:pPr>
-      <w:hyperlink w:anchor="_Toc243264422" w:history="1">
+      <w:hyperlink w:anchor="_Toc243267468" w:history="1">
         <w:r>
           <w:rPr>
             <w:rStyle w:val="Collegamentoipertestuale"/>
@@ -10506,7 +10506,7 @@
             <w:noProof/>
             <w:webHidden/>
           </w:rPr>
-          <w:instrText xml:space="preserve"> PAGEREF _Toc243264422 \h </w:instrText>
+          <w:instrText xml:space="preserve"> PAGEREF _Toc243267468 \h </w:instrText>
         </w:r>
         <w:r>
           <w:rPr>
@@ -10552,7 +10552,7 @@
           <w14:ligatures w14:val="standardContextual"/>
         </w:rPr>
       </w:pPr>
-      <w:hyperlink w:anchor="_Toc243264423" w:history="1">
+      <w:hyperlink w:anchor="_Toc243267469" w:history="1">
         <w:r>
           <w:rPr>
             <w:rStyle w:val="Collegamentoipertestuale"/>
@@ -10600,7 +10600,7 @@
             <w:noProof/>
             <w:webHidden/>
           </w:rPr>
-          <w:instrText xml:space="preserve"> PAGEREF _Toc243264423 \h </w:instrText>
+          <w:instrText xml:space="preserve"> PAGEREF _Toc243267469 \h </w:instrText>
         </w:r>
         <w:r>
           <w:rPr>
@@ -10647,7 +10647,7 @@
           <w14:ligatures w14:val="standardContextual"/>
         </w:rPr>
       </w:pPr>
-      <w:hyperlink w:anchor="_Toc243264424" w:history="1">
+      <w:hyperlink w:anchor="_Toc243267470" w:history="1">
         <w:r>
           <w:rPr>
             <w:rStyle w:val="Collegamentoipertestuale"/>
@@ -10692,7 +10692,7 @@
             <w:noProof/>
             <w:webHidden/>
           </w:rPr>
-          <w:instrText xml:space="preserve"> PAGEREF _Toc243264424 \h </w:instrText>
+          <w:instrText xml:space="preserve"> PAGEREF _Toc243267470 \h </w:instrText>
         </w:r>
         <w:r>
           <w:rPr>
@@ -10739,7 +10739,7 @@
           <w14:ligatures w14:val="standardContextual"/>
         </w:rPr>
       </w:pPr>
-      <w:hyperlink w:anchor="_Toc243264425" w:history="1">
+      <w:hyperlink w:anchor="_Toc243267471" w:history="1">
         <w:r>
           <w:rPr>
             <w:rStyle w:val="Collegamentoipertestuale"/>
@@ -10784,7 +10784,7 @@
             <w:noProof/>
             <w:webHidden/>
           </w:rPr>
-          <w:instrText xml:space="preserve"> PAGEREF _Toc243264425 \h </w:instrText>
+          <w:instrText xml:space="preserve"> PAGEREF _Toc243267471 \h </w:instrText>
         </w:r>
         <w:r>
           <w:rPr>
@@ -10831,7 +10831,7 @@
           <w14:ligatures w14:val="standardContextual"/>
         </w:rPr>
       </w:pPr>
-      <w:hyperlink w:anchor="_Toc243264426" w:history="1">
+      <w:hyperlink w:anchor="_Toc243267472" w:history="1">
         <w:r>
           <w:rPr>
             <w:rStyle w:val="Collegamentoipertestuale"/>
@@ -10876,7 +10876,7 @@
             <w:noProof/>
             <w:webHidden/>
           </w:rPr>
-          <w:instrText xml:space="preserve"> PAGEREF _Toc243264426 \h </w:instrText>
+          <w:instrText xml:space="preserve"> PAGEREF _Toc243267472 \h </w:instrText>
         </w:r>
         <w:r>
           <w:rPr>
@@ -10922,7 +10922,7 @@
           <w14:ligatures w14:val="standardContextual"/>
         </w:rPr>
       </w:pPr>
-      <w:hyperlink w:anchor="_Toc243264427" w:history="1">
+      <w:hyperlink w:anchor="_Toc243267473" w:history="1">
         <w:r>
           <w:rPr>
             <w:rStyle w:val="Collegamentoipertestuale"/>
@@ -10970,7 +10970,7 @@
             <w:noProof/>
             <w:webHidden/>
           </w:rPr>
-          <w:instrText xml:space="preserve"> PAGEREF _Toc243264427 \h </w:instrText>
+          <w:instrText xml:space="preserve"> PAGEREF _Toc243267473 \h </w:instrText>
         </w:r>
         <w:r>
           <w:rPr>
@@ -11017,7 +11017,7 @@
           <w14:ligatures w14:val="standardContextual"/>
         </w:rPr>
       </w:pPr>
-      <w:hyperlink w:anchor="_Toc243264428" w:history="1">
+      <w:hyperlink w:anchor="_Toc243267474" w:history="1">
         <w:r>
           <w:rPr>
             <w:rStyle w:val="Collegamentoipertestuale"/>
@@ -11062,7 +11062,7 @@
             <w:noProof/>
             <w:webHidden/>
           </w:rPr>
-          <w:instrText xml:space="preserve"> PAGEREF _Toc243264428 \h </w:instrText>
+          <w:instrText xml:space="preserve"> PAGEREF _Toc243267474 \h </w:instrText>
         </w:r>
         <w:r>
           <w:rPr>
@@ -11109,7 +11109,7 @@
           <w14:ligatures w14:val="standardContextual"/>
         </w:rPr>
       </w:pPr>
-      <w:hyperlink w:anchor="_Toc243264429" w:history="1">
+      <w:hyperlink w:anchor="_Toc243267475" w:history="1">
         <w:r>
           <w:rPr>
             <w:rStyle w:val="Collegamentoipertestuale"/>
@@ -11154,7 +11154,7 @@
             <w:noProof/>
             <w:webHidden/>
           </w:rPr>
-          <w:instrText xml:space="preserve"> PAGEREF _Toc243264429 \h </w:instrText>
+          <w:instrText xml:space="preserve"> PAGEREF _Toc243267475 \h </w:instrText>
         </w:r>
         <w:r>
           <w:rPr>
@@ -11201,7 +11201,7 @@
           <w14:ligatures w14:val="standardContextual"/>
         </w:rPr>
       </w:pPr>
-      <w:hyperlink w:anchor="_Toc243264430" w:history="1">
+      <w:hyperlink w:anchor="_Toc243267476" w:history="1">
         <w:r>
           <w:rPr>
             <w:rStyle w:val="Collegamentoipertestuale"/>
@@ -11246,7 +11246,7 @@
             <w:noProof/>
             <w:webHidden/>
           </w:rPr>
-          <w:instrText xml:space="preserve"> PAGEREF _Toc243264430 \h </w:instrText>
+          <w:instrText xml:space="preserve"> PAGEREF _Toc243267476 \h </w:instrText>
         </w:r>
         <w:r>
           <w:rPr>
@@ -11293,7 +11293,7 @@
           <w14:ligatures w14:val="standardContextual"/>
         </w:rPr>
       </w:pPr>
-      <w:hyperlink w:anchor="_Toc243264431" w:history="1">
+      <w:hyperlink w:anchor="_Toc243267477" w:history="1">
         <w:r>
           <w:rPr>
             <w:rStyle w:val="Collegamentoipertestuale"/>
@@ -11338,7 +11338,7 @@
             <w:noProof/>
             <w:webHidden/>
           </w:rPr>
-          <w:instrText xml:space="preserve"> PAGEREF _Toc243264431 \h </w:instrText>
+          <w:instrText xml:space="preserve"> PAGEREF _Toc243267477 \h </w:instrText>
         </w:r>
         <w:r>
           <w:rPr>
@@ -11385,7 +11385,7 @@
           <w14:ligatures w14:val="standardContextual"/>
         </w:rPr>
       </w:pPr>
-      <w:hyperlink w:anchor="_Toc243264432" w:history="1">
+      <w:hyperlink w:anchor="_Toc243267478" w:history="1">
         <w:r>
           <w:rPr>
             <w:rStyle w:val="Collegamentoipertestuale"/>
@@ -11430,7 +11430,7 @@
             <w:noProof/>
             <w:webHidden/>
           </w:rPr>
-          <w:instrText xml:space="preserve"> PAGEREF _Toc243264432 \h </w:instrText>
+          <w:instrText xml:space="preserve"> PAGEREF _Toc243267478 \h </w:instrText>
         </w:r>
         <w:r>
           <w:rPr>
@@ -11477,7 +11477,7 @@
           <w14:ligatures w14:val="standardContextual"/>
         </w:rPr>
       </w:pPr>
-      <w:hyperlink w:anchor="_Toc243264433" w:history="1">
+      <w:hyperlink w:anchor="_Toc243267479" w:history="1">
         <w:r>
           <w:rPr>
             <w:rStyle w:val="Collegamentoipertestuale"/>
@@ -11522,7 +11522,7 @@
             <w:noProof/>
             <w:webHidden/>
           </w:rPr>
-          <w:instrText xml:space="preserve"> PAGEREF _Toc243264433 \h </w:instrText>
+          <w:instrText xml:space="preserve"> PAGEREF _Toc243267479 \h </w:instrText>
         </w:r>
         <w:r>
           <w:rPr>
@@ -11569,7 +11569,7 @@
           <w14:ligatures w14:val="standardContextual"/>
         </w:rPr>
       </w:pPr>
-      <w:hyperlink w:anchor="_Toc243264434" w:history="1">
+      <w:hyperlink w:anchor="_Toc243267480" w:history="1">
         <w:r>
           <w:rPr>
             <w:rStyle w:val="Collegamentoipertestuale"/>
@@ -11614,7 +11614,7 @@
             <w:noProof/>
             <w:webHidden/>
           </w:rPr>
-          <w:instrText xml:space="preserve"> PAGEREF _Toc243264434 \h </w:instrText>
+          <w:instrText xml:space="preserve"> PAGEREF _Toc243267480 \h </w:instrText>
         </w:r>
         <w:r>
           <w:rPr>
@@ -11661,7 +11661,7 @@
           <w14:ligatures w14:val="standardContextual"/>
         </w:rPr>
       </w:pPr>
-      <w:hyperlink w:anchor="_Toc243264435" w:history="1">
+      <w:hyperlink w:anchor="_Toc243267481" w:history="1">
         <w:r>
           <w:rPr>
             <w:rStyle w:val="Collegamentoipertestuale"/>
@@ -11706,7 +11706,7 @@
             <w:noProof/>
             <w:webHidden/>
           </w:rPr>
-          <w:instrText xml:space="preserve"> PAGEREF _Toc243264435 \h </w:instrText>
+          <w:instrText xml:space="preserve"> PAGEREF _Toc243267481 \h </w:instrText>
         </w:r>
         <w:r>
           <w:rPr>
@@ -11753,7 +11753,7 @@
           <w14:ligatures w14:val="standardContextual"/>
         </w:rPr>
       </w:pPr>
-      <w:hyperlink w:anchor="_Toc243264436" w:history="1">
+      <w:hyperlink w:anchor="_Toc243267482" w:history="1">
         <w:r>
           <w:rPr>
             <w:rStyle w:val="Collegamentoipertestuale"/>
@@ -11798,7 +11798,7 @@
             <w:noProof/>
             <w:webHidden/>
           </w:rPr>
-          <w:instrText xml:space="preserve"> PAGEREF _Toc243264436 \h </w:instrText>
+          <w:instrText xml:space="preserve"> PAGEREF _Toc243267482 \h </w:instrText>
         </w:r>
         <w:r>
           <w:rPr>
@@ -11845,7 +11845,7 @@
           <w14:ligatures w14:val="standardContextual"/>
         </w:rPr>
       </w:pPr>
-      <w:hyperlink w:anchor="_Toc243264437" w:history="1">
+      <w:hyperlink w:anchor="_Toc243267483" w:history="1">
         <w:r>
           <w:rPr>
             <w:rStyle w:val="Collegamentoipertestuale"/>
@@ -11890,7 +11890,7 @@
             <w:noProof/>
             <w:webHidden/>
           </w:rPr>
-          <w:instrText xml:space="preserve"> PAGEREF _Toc243264437 \h </w:instrText>
+          <w:instrText xml:space="preserve"> PAGEREF _Toc243267483 \h </w:instrText>
         </w:r>
         <w:r>
           <w:rPr>
@@ -11937,7 +11937,7 @@
           <w14:ligatures w14:val="standardContextual"/>
         </w:rPr>
       </w:pPr>
-      <w:hyperlink w:anchor="_Toc243264438" w:history="1">
+      <w:hyperlink w:anchor="_Toc243267484" w:history="1">
         <w:r>
           <w:rPr>
             <w:rStyle w:val="Collegamentoipertestuale"/>
@@ -11982,7 +11982,7 @@
             <w:noProof/>
             <w:webHidden/>
           </w:rPr>
-          <w:instrText xml:space="preserve"> PAGEREF _Toc243264438 \h </w:instrText>
+          <w:instrText xml:space="preserve"> PAGEREF _Toc243267484 \h </w:instrText>
         </w:r>
         <w:r>
           <w:rPr>
@@ -12029,7 +12029,7 @@
           <w14:ligatures w14:val="standardContextual"/>
         </w:rPr>
       </w:pPr>
-      <w:hyperlink w:anchor="_Toc243264439" w:history="1">
+      <w:hyperlink w:anchor="_Toc243267485" w:history="1">
         <w:r>
           <w:rPr>
             <w:rStyle w:val="Collegamentoipertestuale"/>
@@ -12074,7 +12074,7 @@
             <w:noProof/>
             <w:webHidden/>
           </w:rPr>
-          <w:instrText xml:space="preserve"> PAGEREF _Toc243264439 \h </w:instrText>
+          <w:instrText xml:space="preserve"> PAGEREF _Toc243267485 \h </w:instrText>
         </w:r>
         <w:r>
           <w:rPr>
@@ -12120,7 +12120,7 @@
           <w14:ligatures w14:val="standardContextual"/>
         </w:rPr>
       </w:pPr>
-      <w:hyperlink w:anchor="_Toc243264440" w:history="1">
+      <w:hyperlink w:anchor="_Toc243267486" w:history="1">
         <w:r>
           <w:rPr>
             <w:rStyle w:val="Collegamentoipertestuale"/>
@@ -12168,7 +12168,7 @@
             <w:noProof/>
             <w:webHidden/>
           </w:rPr>
-          <w:instrText xml:space="preserve"> PAGEREF _Toc243264440 \h </w:instrText>
+          <w:instrText xml:space="preserve"> PAGEREF _Toc243267486 \h </w:instrText>
         </w:r>
         <w:r>
           <w:rPr>
@@ -12215,7 +12215,7 @@
           <w14:ligatures w14:val="standardContextual"/>
         </w:rPr>
       </w:pPr>
-      <w:hyperlink w:anchor="_Toc243264441" w:history="1">
+      <w:hyperlink w:anchor="_Toc243267487" w:history="1">
         <w:r>
           <w:rPr>
             <w:rStyle w:val="Collegamentoipertestuale"/>
@@ -12260,7 +12260,7 @@
             <w:noProof/>
             <w:webHidden/>
           </w:rPr>
-          <w:instrText xml:space="preserve"> PAGEREF _Toc243264441 \h </w:instrText>
+          <w:instrText xml:space="preserve"> PAGEREF _Toc243267487 \h </w:instrText>
         </w:r>
         <w:r>
           <w:rPr>
@@ -12307,7 +12307,7 @@
           <w14:ligatures w14:val="standardContextual"/>
         </w:rPr>
       </w:pPr>
-      <w:hyperlink w:anchor="_Toc243264442" w:history="1">
+      <w:hyperlink w:anchor="_Toc243267488" w:history="1">
         <w:r>
           <w:rPr>
             <w:rStyle w:val="Collegamentoipertestuale"/>
@@ -12352,7 +12352,7 @@
             <w:noProof/>
             <w:webHidden/>
           </w:rPr>
-          <w:instrText xml:space="preserve"> PAGEREF _Toc243264442 \h </w:instrText>
+          <w:instrText xml:space="preserve"> PAGEREF _Toc243267488 \h </w:instrText>
         </w:r>
         <w:r>
           <w:rPr>
@@ -12399,7 +12399,7 @@
           <w14:ligatures w14:val="standardContextual"/>
         </w:rPr>
       </w:pPr>
-      <w:hyperlink w:anchor="_Toc243264443" w:history="1">
+      <w:hyperlink w:anchor="_Toc243267489" w:history="1">
         <w:r>
           <w:rPr>
             <w:rStyle w:val="Collegamentoipertestuale"/>
@@ -12444,7 +12444,7 @@
             <w:noProof/>
             <w:webHidden/>
           </w:rPr>
-          <w:instrText xml:space="preserve"> PAGEREF _Toc243264443 \h </w:instrText>
+          <w:instrText xml:space="preserve"> PAGEREF _Toc243267489 \h </w:instrText>
         </w:r>
         <w:r>
           <w:rPr>
@@ -12491,7 +12491,7 @@
           <w14:ligatures w14:val="standardContextual"/>
         </w:rPr>
       </w:pPr>
-      <w:hyperlink w:anchor="_Toc243264444" w:history="1">
+      <w:hyperlink w:anchor="_Toc243267490" w:history="1">
         <w:r>
           <w:rPr>
             <w:rStyle w:val="Collegamentoipertestuale"/>
@@ -12536,7 +12536,7 @@
             <w:noProof/>
             <w:webHidden/>
           </w:rPr>
-          <w:instrText xml:space="preserve"> PAGEREF _Toc243264444 \h </w:instrText>
+          <w:instrText xml:space="preserve"> PAGEREF _Toc243267490 \h </w:instrText>
         </w:r>
         <w:r>
           <w:rPr>
@@ -12583,7 +12583,7 @@
           <w14:ligatures w14:val="standardContextual"/>
         </w:rPr>
       </w:pPr>
-      <w:hyperlink w:anchor="_Toc243264445" w:history="1">
+      <w:hyperlink w:anchor="_Toc243267491" w:history="1">
         <w:r>
           <w:rPr>
             <w:rStyle w:val="Collegamentoipertestuale"/>
@@ -12628,7 +12628,7 @@
             <w:noProof/>
             <w:webHidden/>
           </w:rPr>
-          <w:instrText xml:space="preserve"> PAGEREF _Toc243264445 \h </w:instrText>
+          <w:instrText xml:space="preserve"> PAGEREF _Toc243267491 \h </w:instrText>
         </w:r>
         <w:r>
           <w:rPr>
@@ -12675,7 +12675,7 @@
           <w14:ligatures w14:val="standardContextual"/>
         </w:rPr>
       </w:pPr>
-      <w:hyperlink w:anchor="_Toc243264446" w:history="1">
+      <w:hyperlink w:anchor="_Toc243267492" w:history="1">
         <w:r>
           <w:rPr>
             <w:rStyle w:val="Collegamentoipertestuale"/>
@@ -12720,7 +12720,7 @@
             <w:noProof/>
             <w:webHidden/>
           </w:rPr>
-          <w:instrText xml:space="preserve"> PAGEREF _Toc243264446 \h </w:instrText>
+          <w:instrText xml:space="preserve"> PAGEREF _Toc243267492 \h </w:instrText>
         </w:r>
         <w:r>
           <w:rPr>
@@ -12767,7 +12767,7 @@
           <w14:ligatures w14:val="standardContextual"/>
         </w:rPr>
       </w:pPr>
-      <w:hyperlink w:anchor="_Toc243264447" w:history="1">
+      <w:hyperlink w:anchor="_Toc243267493" w:history="1">
         <w:r>
           <w:rPr>
             <w:rStyle w:val="Collegamentoipertestuale"/>
@@ -12812,7 +12812,7 @@
             <w:noProof/>
             <w:webHidden/>
           </w:rPr>
-          <w:instrText xml:space="preserve"> PAGEREF _Toc243264447 \h </w:instrText>
+          <w:instrText xml:space="preserve"> PAGEREF _Toc243267493 \h </w:instrText>
         </w:r>
         <w:r>
           <w:rPr>
@@ -12858,7 +12858,7 @@
           <w14:ligatures w14:val="standardContextual"/>
         </w:rPr>
       </w:pPr>
-      <w:hyperlink w:anchor="_Toc243264448" w:history="1">
+      <w:hyperlink w:anchor="_Toc243267494" w:history="1">
         <w:r>
           <w:rPr>
             <w:rStyle w:val="Collegamentoipertestuale"/>
@@ -12906,7 +12906,7 @@
             <w:noProof/>
             <w:webHidden/>
           </w:rPr>
-          <w:instrText xml:space="preserve"> PAGEREF _Toc243264448 \h </w:instrText>
+          <w:instrText xml:space="preserve"> PAGEREF _Toc243267494 \h </w:instrText>
         </w:r>
         <w:r>
           <w:rPr>
@@ -12953,7 +12953,7 @@
           <w14:ligatures w14:val="standardContextual"/>
         </w:rPr>
       </w:pPr>
-      <w:hyperlink w:anchor="_Toc243264449" w:history="1">
+      <w:hyperlink w:anchor="_Toc243267495" w:history="1">
         <w:r>
           <w:rPr>
             <w:rStyle w:val="Collegamentoipertestuale"/>
@@ -12998,7 +12998,7 @@
             <w:noProof/>
             <w:webHidden/>
           </w:rPr>
-          <w:instrText xml:space="preserve"> PAGEREF _Toc243264449 \h </w:instrText>
+          <w:instrText xml:space="preserve"> PAGEREF _Toc243267495 \h </w:instrText>
         </w:r>
         <w:r>
           <w:rPr>
@@ -13045,7 +13045,7 @@
           <w14:ligatures w14:val="standardContextual"/>
         </w:rPr>
       </w:pPr>
-      <w:hyperlink w:anchor="_Toc243264450" w:history="1">
+      <w:hyperlink w:anchor="_Toc243267496" w:history="1">
         <w:r>
           <w:rPr>
             <w:rStyle w:val="Collegamentoipertestuale"/>
@@ -13090,7 +13090,7 @@
             <w:noProof/>
             <w:webHidden/>
           </w:rPr>
-          <w:instrText xml:space="preserve"> PAGEREF _Toc243264450 \h </w:instrText>
+          <w:instrText xml:space="preserve"> PAGEREF _Toc243267496 \h </w:instrText>
         </w:r>
         <w:r>
           <w:rPr>
@@ -13137,7 +13137,7 @@
           <w14:ligatures w14:val="standardContextual"/>
         </w:rPr>
       </w:pPr>
-      <w:hyperlink w:anchor="_Toc243264451" w:history="1">
+      <w:hyperlink w:anchor="_Toc243267497" w:history="1">
         <w:r>
           <w:rPr>
             <w:rStyle w:val="Collegamentoipertestuale"/>
@@ -13182,7 +13182,7 @@
             <w:noProof/>
             <w:webHidden/>
           </w:rPr>
-          <w:instrText xml:space="preserve"> PAGEREF _Toc243264451 \h </w:instrText>
+          <w:instrText xml:space="preserve"> PAGEREF _Toc243267497 \h </w:instrText>
         </w:r>
         <w:r>
           <w:rPr>
@@ -13229,7 +13229,7 @@
           <w14:ligatures w14:val="standardContextual"/>
         </w:rPr>
       </w:pPr>
-      <w:hyperlink w:anchor="_Toc243264452" w:history="1">
+      <w:hyperlink w:anchor="_Toc243267498" w:history="1">
         <w:r>
           <w:rPr>
             <w:rStyle w:val="Collegamentoipertestuale"/>
@@ -13274,7 +13274,7 @@
             <w:noProof/>
             <w:webHidden/>
           </w:rPr>
-          <w:instrText xml:space="preserve"> PAGEREF _Toc243264452 \h </w:instrText>
+          <w:instrText xml:space="preserve"> PAGEREF _Toc243267498 \h </w:instrText>
         </w:r>
         <w:r>
           <w:rPr>
@@ -13321,7 +13321,7 @@
           <w14:ligatures w14:val="standardContextual"/>
         </w:rPr>
       </w:pPr>
-      <w:hyperlink w:anchor="_Toc243264453" w:history="1">
+      <w:hyperlink w:anchor="_Toc243267499" w:history="1">
         <w:r>
           <w:rPr>
             <w:rStyle w:val="Collegamentoipertestuale"/>
@@ -13366,7 +13366,7 @@
             <w:noProof/>
             <w:webHidden/>
           </w:rPr>
-          <w:instrText xml:space="preserve"> PAGEREF _Toc243264453 \h </w:instrText>
+          <w:instrText xml:space="preserve"> PAGEREF _Toc243267499 \h </w:instrText>
         </w:r>
         <w:r>
           <w:rPr>
@@ -13413,7 +13413,7 @@
           <w14:ligatures w14:val="standardContextual"/>
         </w:rPr>
       </w:pPr>
-      <w:hyperlink w:anchor="_Toc243264454" w:history="1">
+      <w:hyperlink w:anchor="_Toc243267500" w:history="1">
         <w:r>
           <w:rPr>
             <w:rStyle w:val="Collegamentoipertestuale"/>
@@ -13458,7 +13458,7 @@
             <w:noProof/>
             <w:webHidden/>
           </w:rPr>
-          <w:instrText xml:space="preserve"> PAGEREF _Toc243264454 \h </w:instrText>
+          <w:instrText xml:space="preserve"> PAGEREF _Toc243267500 \h </w:instrText>
         </w:r>
         <w:r>
           <w:rPr>
@@ -13505,7 +13505,7 @@
           <w14:ligatures w14:val="standardContextual"/>
         </w:rPr>
       </w:pPr>
-      <w:hyperlink w:anchor="_Toc243264455" w:history="1">
+      <w:hyperlink w:anchor="_Toc243267501" w:history="1">
         <w:r>
           <w:rPr>
             <w:rStyle w:val="Collegamentoipertestuale"/>
@@ -13550,7 +13550,7 @@
             <w:noProof/>
             <w:webHidden/>
           </w:rPr>
-          <w:instrText xml:space="preserve"> PAGEREF _Toc243264455 \h </w:instrText>
+          <w:instrText xml:space="preserve"> PAGEREF _Toc243267501 \h </w:instrText>
         </w:r>
         <w:r>
           <w:rPr>
@@ -13597,7 +13597,7 @@
           <w14:ligatures w14:val="standardContextual"/>
         </w:rPr>
       </w:pPr>
-      <w:hyperlink w:anchor="_Toc243264456" w:history="1">
+      <w:hyperlink w:anchor="_Toc243267502" w:history="1">
         <w:r>
           <w:rPr>
             <w:rStyle w:val="Collegamentoipertestuale"/>
@@ -13642,7 +13642,7 @@
             <w:noProof/>
             <w:webHidden/>
           </w:rPr>
-          <w:instrText xml:space="preserve"> PAGEREF _Toc243264456 \h </w:instrText>
+          <w:instrText xml:space="preserve"> PAGEREF _Toc243267502 \h </w:instrText>
         </w:r>
         <w:r>
           <w:rPr>
@@ -13689,7 +13689,7 @@
           <w14:ligatures w14:val="standardContextual"/>
         </w:rPr>
       </w:pPr>
-      <w:hyperlink w:anchor="_Toc243264457" w:history="1">
+      <w:hyperlink w:anchor="_Toc243267503" w:history="1">
         <w:r>
           <w:rPr>
             <w:rStyle w:val="Collegamentoipertestuale"/>
@@ -13734,7 +13734,7 @@
             <w:noProof/>
             <w:webHidden/>
           </w:rPr>
-          <w:instrText xml:space="preserve"> PAGEREF _Toc243264457 \h </w:instrText>
+          <w:instrText xml:space="preserve"> PAGEREF _Toc243267503 \h </w:instrText>
         </w:r>
         <w:r>
           <w:rPr>
@@ -13781,7 +13781,7 @@
           <w14:ligatures w14:val="standardContextual"/>
         </w:rPr>
       </w:pPr>
-      <w:hyperlink w:anchor="_Toc243264458" w:history="1">
+      <w:hyperlink w:anchor="_Toc243267504" w:history="1">
         <w:r>
           <w:rPr>
             <w:rStyle w:val="Collegamentoipertestuale"/>
@@ -13826,7 +13826,7 @@
             <w:noProof/>
             <w:webHidden/>
           </w:rPr>
-          <w:instrText xml:space="preserve"> PAGEREF _Toc243264458 \h </w:instrText>
+          <w:instrText xml:space="preserve"> PAGEREF _Toc243267504 \h </w:instrText>
         </w:r>
         <w:r>
           <w:rPr>
@@ -13873,7 +13873,7 @@
           <w14:ligatures w14:val="standardContextual"/>
         </w:rPr>
       </w:pPr>
-      <w:hyperlink w:anchor="_Toc243264459" w:history="1">
+      <w:hyperlink w:anchor="_Toc243267505" w:history="1">
         <w:r>
           <w:rPr>
             <w:rStyle w:val="Collegamentoipertestuale"/>
@@ -13918,7 +13918,7 @@
             <w:noProof/>
             <w:webHidden/>
           </w:rPr>
-          <w:instrText xml:space="preserve"> PAGEREF _Toc243264459 \h </w:instrText>
+          <w:instrText xml:space="preserve"> PAGEREF _Toc243267505 \h </w:instrText>
         </w:r>
         <w:r>
           <w:rPr>
@@ -13965,7 +13965,7 @@
           <w14:ligatures w14:val="standardContextual"/>
         </w:rPr>
       </w:pPr>
-      <w:hyperlink w:anchor="_Toc243264460" w:history="1">
+      <w:hyperlink w:anchor="_Toc243267506" w:history="1">
         <w:r>
           <w:rPr>
             <w:rStyle w:val="Collegamentoipertestuale"/>
@@ -14010,7 +14010,7 @@
             <w:noProof/>
             <w:webHidden/>
           </w:rPr>
-          <w:instrText xml:space="preserve"> PAGEREF _Toc243264460 \h </w:instrText>
+          <w:instrText xml:space="preserve"> PAGEREF _Toc243267506 \h </w:instrText>
         </w:r>
         <w:r>
           <w:rPr>
@@ -14057,7 +14057,7 @@
           <w14:ligatures w14:val="standardContextual"/>
         </w:rPr>
       </w:pPr>
-      <w:hyperlink w:anchor="_Toc243264461" w:history="1">
+      <w:hyperlink w:anchor="_Toc243267507" w:history="1">
         <w:r>
           <w:rPr>
             <w:rStyle w:val="Collegamentoipertestuale"/>
@@ -14102,7 +14102,7 @@
             <w:noProof/>
             <w:webHidden/>
           </w:rPr>
-          <w:instrText xml:space="preserve"> PAGEREF _Toc243264461 \h </w:instrText>
+          <w:instrText xml:space="preserve"> PAGEREF _Toc243267507 \h </w:instrText>
         </w:r>
         <w:r>
           <w:rPr>
@@ -14149,7 +14149,7 @@
           <w14:ligatures w14:val="standardContextual"/>
         </w:rPr>
       </w:pPr>
-      <w:hyperlink w:anchor="_Toc243264462" w:history="1">
+      <w:hyperlink w:anchor="_Toc243267508" w:history="1">
         <w:r>
           <w:rPr>
             <w:rStyle w:val="Collegamentoipertestuale"/>
@@ -14194,7 +14194,7 @@
             <w:noProof/>
             <w:webHidden/>
           </w:rPr>
-          <w:instrText xml:space="preserve"> PAGEREF _Toc243264462 \h </w:instrText>
+          <w:instrText xml:space="preserve"> PAGEREF _Toc243267508 \h </w:instrText>
         </w:r>
         <w:r>
           <w:rPr>
@@ -14241,7 +14241,7 @@
           <w14:ligatures w14:val="standardContextual"/>
         </w:rPr>
       </w:pPr>
-      <w:hyperlink w:anchor="_Toc243264463" w:history="1">
+      <w:hyperlink w:anchor="_Toc243267509" w:history="1">
         <w:r>
           <w:rPr>
             <w:rStyle w:val="Collegamentoipertestuale"/>
@@ -14286,7 +14286,7 @@
             <w:noProof/>
             <w:webHidden/>
           </w:rPr>
-          <w:instrText xml:space="preserve"> PAGEREF _Toc243264463 \h </w:instrText>
+          <w:instrText xml:space="preserve"> PAGEREF _Toc243267509 \h </w:instrText>
         </w:r>
         <w:r>
           <w:rPr>
@@ -14333,7 +14333,7 @@
           <w14:ligatures w14:val="standardContextual"/>
         </w:rPr>
       </w:pPr>
-      <w:hyperlink w:anchor="_Toc243264464" w:history="1">
+      <w:hyperlink w:anchor="_Toc243267510" w:history="1">
         <w:r>
           <w:rPr>
             <w:rStyle w:val="Collegamentoipertestuale"/>
@@ -14378,7 +14378,7 @@
             <w:noProof/>
             <w:webHidden/>
           </w:rPr>
-          <w:instrText xml:space="preserve"> PAGEREF _Toc243264464 \h </w:instrText>
+          <w:instrText xml:space="preserve"> PAGEREF _Toc243267510 \h </w:instrText>
         </w:r>
         <w:r>
           <w:rPr>
@@ -14425,7 +14425,7 @@
           <w14:ligatures w14:val="standardContextual"/>
         </w:rPr>
       </w:pPr>
-      <w:hyperlink w:anchor="_Toc243264465" w:history="1">
+      <w:hyperlink w:anchor="_Toc243267511" w:history="1">
         <w:r>
           <w:rPr>
             <w:rStyle w:val="Collegamentoipertestuale"/>
@@ -14470,7 +14470,7 @@
             <w:noProof/>
             <w:webHidden/>
           </w:rPr>
-          <w:instrText xml:space="preserve"> PAGEREF _Toc243264465 \h </w:instrText>
+          <w:instrText xml:space="preserve"> PAGEREF _Toc243267511 \h </w:instrText>
         </w:r>
         <w:r>
           <w:rPr>
@@ -14516,7 +14516,7 @@
           <w14:ligatures w14:val="standardContextual"/>
         </w:rPr>
       </w:pPr>
-      <w:hyperlink w:anchor="_Toc243264466" w:history="1">
+      <w:hyperlink w:anchor="_Toc243267512" w:history="1">
         <w:r>
           <w:rPr>
             <w:rStyle w:val="Collegamentoipertestuale"/>
@@ -14564,7 +14564,7 @@
             <w:noProof/>
             <w:webHidden/>
           </w:rPr>
-          <w:instrText xml:space="preserve"> PAGEREF _Toc243264466 \h </w:instrText>
+          <w:instrText xml:space="preserve"> PAGEREF _Toc243267512 \h </w:instrText>
         </w:r>
         <w:r>
           <w:rPr>
@@ -14611,7 +14611,7 @@
           <w14:ligatures w14:val="standardContextual"/>
         </w:rPr>
       </w:pPr>
-      <w:hyperlink w:anchor="_Toc243264467" w:history="1">
+      <w:hyperlink w:anchor="_Toc243267513" w:history="1">
         <w:r>
           <w:rPr>
             <w:rStyle w:val="Collegamentoipertestuale"/>
@@ -14656,7 +14656,7 @@
             <w:noProof/>
             <w:webHidden/>
           </w:rPr>
-          <w:instrText xml:space="preserve"> PAGEREF _Toc243264467 \h </w:instrText>
+          <w:instrText xml:space="preserve"> PAGEREF _Toc243267513 \h </w:instrText>
         </w:r>
         <w:r>
           <w:rPr>
@@ -14703,7 +14703,7 @@
           <w14:ligatures w14:val="standardContextual"/>
         </w:rPr>
       </w:pPr>
-      <w:hyperlink w:anchor="_Toc243264468" w:history="1">
+      <w:hyperlink w:anchor="_Toc243267514" w:history="1">
         <w:r>
           <w:rPr>
             <w:rStyle w:val="Collegamentoipertestuale"/>
@@ -14748,7 +14748,7 @@
             <w:noProof/>
             <w:webHidden/>
           </w:rPr>
-          <w:instrText xml:space="preserve"> PAGEREF _Toc243264468 \h </w:instrText>
+          <w:instrText xml:space="preserve"> PAGEREF _Toc243267514 \h </w:instrText>
         </w:r>
         <w:r>
           <w:rPr>
@@ -14795,7 +14795,7 @@
           <w14:ligatures w14:val="standardContextual"/>
         </w:rPr>
       </w:pPr>
-      <w:hyperlink w:anchor="_Toc243264469" w:history="1">
+      <w:hyperlink w:anchor="_Toc243267515" w:history="1">
         <w:r>
           <w:rPr>
             <w:rStyle w:val="Collegamentoipertestuale"/>
@@ -14840,7 +14840,7 @@
             <w:noProof/>
             <w:webHidden/>
           </w:rPr>
-          <w:instrText xml:space="preserve"> PAGEREF _Toc243264469 \h </w:instrText>
+          <w:instrText xml:space="preserve"> PAGEREF _Toc243267515 \h </w:instrText>
         </w:r>
         <w:r>
           <w:rPr>
@@ -14886,7 +14886,7 @@
           <w14:ligatures w14:val="standardContextual"/>
         </w:rPr>
       </w:pPr>
-      <w:hyperlink w:anchor="_Toc243264470" w:history="1">
+      <w:hyperlink w:anchor="_Toc243267516" w:history="1">
         <w:r>
           <w:rPr>
             <w:rStyle w:val="Collegamentoipertestuale"/>
@@ -14934,7 +14934,7 @@
             <w:noProof/>
             <w:webHidden/>
           </w:rPr>
-          <w:instrText xml:space="preserve"> PAGEREF _Toc243264470 \h </w:instrText>
+          <w:instrText xml:space="preserve"> PAGEREF _Toc243267516 \h </w:instrText>
         </w:r>
         <w:r>
           <w:rPr>
@@ -14981,7 +14981,7 @@
           <w14:ligatures w14:val="standardContextual"/>
         </w:rPr>
       </w:pPr>
-      <w:hyperlink w:anchor="_Toc243264471" w:history="1">
+      <w:hyperlink w:anchor="_Toc243267517" w:history="1">
         <w:r>
           <w:rPr>
             <w:rStyle w:val="Collegamentoipertestuale"/>
@@ -15026,7 +15026,7 @@
             <w:noProof/>
             <w:webHidden/>
           </w:rPr>
-          <w:instrText xml:space="preserve"> PAGEREF _Toc243264471 \h </w:instrText>
+          <w:instrText xml:space="preserve"> PAGEREF _Toc243267517 \h </w:instrText>
         </w:r>
         <w:r>
           <w:rPr>
@@ -15073,7 +15073,7 @@
           <w14:ligatures w14:val="standardContextual"/>
         </w:rPr>
       </w:pPr>
-      <w:hyperlink w:anchor="_Toc243264472" w:history="1">
+      <w:hyperlink w:anchor="_Toc243267518" w:history="1">
         <w:r>
           <w:rPr>
             <w:rStyle w:val="Collegamentoipertestuale"/>
@@ -15118,7 +15118,7 @@
             <w:noProof/>
             <w:webHidden/>
           </w:rPr>
-          <w:instrText xml:space="preserve"> PAGEREF _Toc243264472 \h </w:instrText>
+          <w:instrText xml:space="preserve"> PAGEREF _Toc243267518 \h </w:instrText>
         </w:r>
         <w:r>
           <w:rPr>
@@ -15165,7 +15165,7 @@
           <w14:ligatures w14:val="standardContextual"/>
         </w:rPr>
       </w:pPr>
-      <w:hyperlink w:anchor="_Toc243264473" w:history="1">
+      <w:hyperlink w:anchor="_Toc243267519" w:history="1">
         <w:r>
           <w:rPr>
             <w:rStyle w:val="Collegamentoipertestuale"/>
@@ -15210,7 +15210,7 @@
             <w:noProof/>
             <w:webHidden/>
           </w:rPr>
-          <w:instrText xml:space="preserve"> PAGEREF _Toc243264473 \h </w:instrText>
+          <w:instrText xml:space="preserve"> PAGEREF _Toc243267519 \h </w:instrText>
         </w:r>
         <w:r>
           <w:rPr>
@@ -15256,7 +15256,7 @@
           <w14:ligatures w14:val="standardContextual"/>
         </w:rPr>
       </w:pPr>
-      <w:hyperlink w:anchor="_Toc243264474" w:history="1">
+      <w:hyperlink w:anchor="_Toc243267520" w:history="1">
         <w:r>
           <w:rPr>
             <w:rStyle w:val="Collegamentoipertestuale"/>
@@ -15304,7 +15304,7 @@
             <w:noProof/>
             <w:webHidden/>
           </w:rPr>
-          <w:instrText xml:space="preserve"> PAGEREF _Toc243264474 \h </w:instrText>
+          <w:instrText xml:space="preserve"> PAGEREF _Toc243267520 \h </w:instrText>
         </w:r>
         <w:r>
           <w:rPr>
@@ -15351,7 +15351,7 @@
           <w14:ligatures w14:val="standardContextual"/>
         </w:rPr>
       </w:pPr>
-      <w:hyperlink w:anchor="_Toc243264475" w:history="1">
+      <w:hyperlink w:anchor="_Toc243267521" w:history="1">
         <w:r>
           <w:rPr>
             <w:rStyle w:val="Collegamentoipertestuale"/>
@@ -15396,7 +15396,7 @@
             <w:noProof/>
             <w:webHidden/>
           </w:rPr>
-          <w:instrText xml:space="preserve"> PAGEREF _Toc243264475 \h </w:instrText>
+          <w:instrText xml:space="preserve"> PAGEREF _Toc243267521 \h </w:instrText>
         </w:r>
         <w:r>
           <w:rPr>
@@ -15443,7 +15443,7 @@
           <w14:ligatures w14:val="standardContextual"/>
         </w:rPr>
       </w:pPr>
-      <w:hyperlink w:anchor="_Toc243264476" w:history="1">
+      <w:hyperlink w:anchor="_Toc243267522" w:history="1">
         <w:r>
           <w:rPr>
             <w:rStyle w:val="Collegamentoipertestuale"/>
@@ -15488,7 +15488,7 @@
             <w:noProof/>
             <w:webHidden/>
           </w:rPr>
-          <w:instrText xml:space="preserve"> PAGEREF _Toc243264476 \h </w:instrText>
+          <w:instrText xml:space="preserve"> PAGEREF _Toc243267522 \h </w:instrText>
         </w:r>
         <w:r>
           <w:rPr>
@@ -15535,7 +15535,7 @@
           <w14:ligatures w14:val="standardContextual"/>
         </w:rPr>
       </w:pPr>
-      <w:hyperlink w:anchor="_Toc243264477" w:history="1">
+      <w:hyperlink w:anchor="_Toc243267523" w:history="1">
         <w:r>
           <w:rPr>
             <w:rStyle w:val="Collegamentoipertestuale"/>
@@ -15580,7 +15580,7 @@
             <w:noProof/>
             <w:webHidden/>
           </w:rPr>
-          <w:instrText xml:space="preserve"> PAGEREF _Toc243264477 \h </w:instrText>
+          <w:instrText xml:space="preserve"> PAGEREF _Toc243267523 \h </w:instrText>
         </w:r>
         <w:r>
           <w:rPr>
@@ -15627,7 +15627,7 @@
           <w14:ligatures w14:val="standardContextual"/>
         </w:rPr>
       </w:pPr>
-      <w:hyperlink w:anchor="_Toc243264478" w:history="1">
+      <w:hyperlink w:anchor="_Toc243267524" w:history="1">
         <w:r>
           <w:rPr>
             <w:rStyle w:val="Collegamentoipertestuale"/>
@@ -15672,7 +15672,7 @@
             <w:noProof/>
             <w:webHidden/>
           </w:rPr>
-          <w:instrText xml:space="preserve"> PAGEREF _Toc243264478 \h </w:instrText>
+          <w:instrText xml:space="preserve"> PAGEREF _Toc243267524 \h </w:instrText>
         </w:r>
         <w:r>
           <w:rPr>
@@ -15719,7 +15719,7 @@
           <w14:ligatures w14:val="standardContextual"/>
         </w:rPr>
       </w:pPr>
-      <w:hyperlink w:anchor="_Toc243264479" w:history="1">
+      <w:hyperlink w:anchor="_Toc243267525" w:history="1">
         <w:r>
           <w:rPr>
             <w:rStyle w:val="Collegamentoipertestuale"/>
@@ -15764,7 +15764,7 @@
             <w:noProof/>
             <w:webHidden/>
           </w:rPr>
-          <w:instrText xml:space="preserve"> PAGEREF _Toc243264479 \h </w:instrText>
+          <w:instrText xml:space="preserve"> PAGEREF _Toc243267525 \h </w:instrText>
         </w:r>
         <w:r>
           <w:rPr>
@@ -15810,7 +15810,7 @@
           <w14:ligatures w14:val="standardContextual"/>
         </w:rPr>
       </w:pPr>
-      <w:hyperlink w:anchor="_Toc243264480" w:history="1">
+      <w:hyperlink w:anchor="_Toc243267526" w:history="1">
         <w:r>
           <w:rPr>
             <w:rStyle w:val="Collegamentoipertestuale"/>
@@ -15858,7 +15858,7 @@
             <w:noProof/>
             <w:webHidden/>
           </w:rPr>
-          <w:instrText xml:space="preserve"> PAGEREF _Toc243264480 \h </w:instrText>
+          <w:instrText xml:space="preserve"> PAGEREF _Toc243267526 \h </w:instrText>
         </w:r>
         <w:r>
           <w:rPr>
@@ -15905,7 +15905,7 @@
           <w14:ligatures w14:val="standardContextual"/>
         </w:rPr>
       </w:pPr>
-      <w:hyperlink w:anchor="_Toc243264481" w:history="1">
+      <w:hyperlink w:anchor="_Toc243267527" w:history="1">
         <w:r>
           <w:rPr>
             <w:rStyle w:val="Collegamentoipertestuale"/>
@@ -15950,7 +15950,7 @@
             <w:noProof/>
             <w:webHidden/>
           </w:rPr>
-          <w:instrText xml:space="preserve"> PAGEREF _Toc243264481 \h </w:instrText>
+          <w:instrText xml:space="preserve"> PAGEREF _Toc243267527 \h </w:instrText>
         </w:r>
         <w:r>
           <w:rPr>
@@ -15997,7 +15997,7 @@
           <w14:ligatures w14:val="standardContextual"/>
         </w:rPr>
       </w:pPr>
-      <w:hyperlink w:anchor="_Toc243264482" w:history="1">
+      <w:hyperlink w:anchor="_Toc243267528" w:history="1">
         <w:r>
           <w:rPr>
             <w:rStyle w:val="Collegamentoipertestuale"/>
@@ -16042,7 +16042,7 @@
             <w:noProof/>
             <w:webHidden/>
           </w:rPr>
-          <w:instrText xml:space="preserve"> PAGEREF _Toc243264482 \h </w:instrText>
+          <w:instrText xml:space="preserve"> PAGEREF _Toc243267528 \h </w:instrText>
         </w:r>
         <w:r>
           <w:rPr>
@@ -16089,7 +16089,7 @@
           <w14:ligatures w14:val="standardContextual"/>
         </w:rPr>
       </w:pPr>
-      <w:hyperlink w:anchor="_Toc243264483" w:history="1">
+      <w:hyperlink w:anchor="_Toc243267529" w:history="1">
         <w:r>
           <w:rPr>
             <w:rStyle w:val="Collegamentoipertestuale"/>
@@ -16134,7 +16134,7 @@
             <w:noProof/>
             <w:webHidden/>
           </w:rPr>
-          <w:instrText xml:space="preserve"> PAGEREF _Toc243264483 \h </w:instrText>
+          <w:instrText xml:space="preserve"> PAGEREF _Toc243267529 \h </w:instrText>
         </w:r>
         <w:r>
           <w:rPr>
@@ -16181,7 +16181,7 @@
           <w14:ligatures w14:val="standardContextual"/>
         </w:rPr>
       </w:pPr>
-      <w:hyperlink w:anchor="_Toc243264484" w:history="1">
+      <w:hyperlink w:anchor="_Toc243267530" w:history="1">
         <w:r>
           <w:rPr>
             <w:rStyle w:val="Collegamentoipertestuale"/>
@@ -16226,7 +16226,7 @@
             <w:noProof/>
             <w:webHidden/>
           </w:rPr>
-          <w:instrText xml:space="preserve"> PAGEREF _Toc243264484 \h </w:instrText>
+          <w:instrText xml:space="preserve"> PAGEREF _Toc243267530 \h </w:instrText>
         </w:r>
         <w:r>
           <w:rPr>
@@ -16273,7 +16273,7 @@
           <w14:ligatures w14:val="standardContextual"/>
         </w:rPr>
       </w:pPr>
-      <w:hyperlink w:anchor="_Toc243264485" w:history="1">
+      <w:hyperlink w:anchor="_Toc243267531" w:history="1">
         <w:r>
           <w:rPr>
             <w:rStyle w:val="Collegamentoipertestuale"/>
@@ -16318,7 +16318,7 @@
             <w:noProof/>
             <w:webHidden/>
           </w:rPr>
-          <w:instrText xml:space="preserve"> PAGEREF _Toc243264485 \h </w:instrText>
+          <w:instrText xml:space="preserve"> PAGEREF _Toc243267531 \h </w:instrText>
         </w:r>
         <w:r>
           <w:rPr>
@@ -16365,7 +16365,7 @@
           <w14:ligatures w14:val="standardContextual"/>
         </w:rPr>
       </w:pPr>
-      <w:hyperlink w:anchor="_Toc243264486" w:history="1">
+      <w:hyperlink w:anchor="_Toc243267532" w:history="1">
         <w:r>
           <w:rPr>
             <w:rStyle w:val="Collegamentoipertestuale"/>
@@ -16410,7 +16410,7 @@
             <w:noProof/>
             <w:webHidden/>
           </w:rPr>
-          <w:instrText xml:space="preserve"> PAGEREF _Toc243264486 \h </w:instrText>
+          <w:instrText xml:space="preserve"> PAGEREF _Toc243267532 \h </w:instrText>
         </w:r>
         <w:r>
           <w:rPr>
@@ -16457,7 +16457,7 @@
           <w14:ligatures w14:val="standardContextual"/>
         </w:rPr>
       </w:pPr>
-      <w:hyperlink w:anchor="_Toc243264487" w:history="1">
+      <w:hyperlink w:anchor="_Toc243267533" w:history="1">
         <w:r>
           <w:rPr>
             <w:rStyle w:val="Collegamentoipertestuale"/>
@@ -16502,7 +16502,7 @@
             <w:noProof/>
             <w:webHidden/>
           </w:rPr>
-          <w:instrText xml:space="preserve"> PAGEREF _Toc243264487 \h </w:instrText>
+          <w:instrText xml:space="preserve"> PAGEREF _Toc243267533 \h </w:instrText>
         </w:r>
         <w:r>
           <w:rPr>
@@ -16549,7 +16549,7 @@
           <w14:ligatures w14:val="standardContextual"/>
         </w:rPr>
       </w:pPr>
-      <w:hyperlink w:anchor="_Toc243264488" w:history="1">
+      <w:hyperlink w:anchor="_Toc243267534" w:history="1">
         <w:r>
           <w:rPr>
             <w:rStyle w:val="Collegamentoipertestuale"/>
@@ -16594,7 +16594,7 @@
             <w:noProof/>
             <w:webHidden/>
           </w:rPr>
-          <w:instrText xml:space="preserve"> PAGEREF _Toc243264488 \h </w:instrText>
+          <w:instrText xml:space="preserve"> PAGEREF _Toc243267534 \h </w:instrText>
         </w:r>
         <w:r>
           <w:rPr>
@@ -16640,7 +16640,7 @@
           <w14:ligatures w14:val="standardContextual"/>
         </w:rPr>
       </w:pPr>
-      <w:hyperlink w:anchor="_Toc243264489" w:history="1">
+      <w:hyperlink w:anchor="_Toc243267535" w:history="1">
         <w:r>
           <w:rPr>
             <w:rStyle w:val="Collegamentoipertestuale"/>
@@ -16688,7 +16688,7 @@
             <w:noProof/>
             <w:webHidden/>
           </w:rPr>
-          <w:instrText xml:space="preserve"> PAGEREF _Toc243264489 \h </w:instrText>
+          <w:instrText xml:space="preserve"> PAGEREF _Toc243267535 \h </w:instrText>
         </w:r>
         <w:r>
           <w:rPr>
@@ -16735,7 +16735,7 @@
           <w14:ligatures w14:val="standardContextual"/>
         </w:rPr>
       </w:pPr>
-      <w:hyperlink w:anchor="_Toc243264490" w:history="1">
+      <w:hyperlink w:anchor="_Toc243267536" w:history="1">
         <w:r>
           <w:rPr>
             <w:rStyle w:val="Collegamentoipertestuale"/>
@@ -16780,7 +16780,7 @@
             <w:noProof/>
             <w:webHidden/>
           </w:rPr>
-          <w:instrText xml:space="preserve"> PAGEREF _Toc243264490 \h </w:instrText>
+          <w:instrText xml:space="preserve"> PAGEREF _Toc243267536 \h </w:instrText>
         </w:r>
         <w:r>
           <w:rPr>
@@ -16827,7 +16827,7 @@
           <w14:ligatures w14:val="standardContextual"/>
         </w:rPr>
       </w:pPr>
-      <w:hyperlink w:anchor="_Toc243264491" w:history="1">
+      <w:hyperlink w:anchor="_Toc243267537" w:history="1">
         <w:r>
           <w:rPr>
             <w:rStyle w:val="Collegamentoipertestuale"/>
@@ -16872,7 +16872,7 @@
             <w:noProof/>
             <w:webHidden/>
           </w:rPr>
-          <w:instrText xml:space="preserve"> PAGEREF _Toc243264491 \h </w:instrText>
+          <w:instrText xml:space="preserve"> PAGEREF _Toc243267537 \h </w:instrText>
         </w:r>
         <w:r>
           <w:rPr>
@@ -16919,7 +16919,7 @@
           <w14:ligatures w14:val="standardContextual"/>
         </w:rPr>
       </w:pPr>
-      <w:hyperlink w:anchor="_Toc243264492" w:history="1">
+      <w:hyperlink w:anchor="_Toc243267538" w:history="1">
         <w:r>
           <w:rPr>
             <w:rStyle w:val="Collegamentoipertestuale"/>
@@ -16964,7 +16964,7 @@
             <w:noProof/>
             <w:webHidden/>
           </w:rPr>
-          <w:instrText xml:space="preserve"> PAGEREF _Toc243264492 \h </w:instrText>
+          <w:instrText xml:space="preserve"> PAGEREF _Toc243267538 \h </w:instrText>
         </w:r>
         <w:r>
           <w:rPr>
@@ -17010,7 +17010,7 @@
           <w14:ligatures w14:val="standardContextual"/>
         </w:rPr>
       </w:pPr>
-      <w:hyperlink w:anchor="_Toc243264493" w:history="1">
+      <w:hyperlink w:anchor="_Toc243267539" w:history="1">
         <w:r>
           <w:rPr>
             <w:rStyle w:val="Collegamentoipertestuale"/>
@@ -17058,7 +17058,7 @@
             <w:noProof/>
             <w:webHidden/>
           </w:rPr>
-          <w:instrText xml:space="preserve"> PAGEREF _Toc243264493 \h </w:instrText>
+          <w:instrText xml:space="preserve"> PAGEREF _Toc243267539 \h </w:instrText>
         </w:r>
         <w:r>
           <w:rPr>
@@ -17105,7 +17105,7 @@
           <w14:ligatures w14:val="standardContextual"/>
         </w:rPr>
       </w:pPr>
-      <w:hyperlink w:anchor="_Toc243264494" w:history="1">
+      <w:hyperlink w:anchor="_Toc243267540" w:history="1">
         <w:r>
           <w:rPr>
             <w:rStyle w:val="Collegamentoipertestuale"/>
@@ -17150,7 +17150,7 @@
             <w:noProof/>
             <w:webHidden/>
           </w:rPr>
-          <w:instrText xml:space="preserve"> PAGEREF _Toc243264494 \h </w:instrText>
+          <w:instrText xml:space="preserve"> PAGEREF _Toc243267540 \h </w:instrText>
         </w:r>
         <w:r>
           <w:rPr>
@@ -17197,7 +17197,7 @@
           <w14:ligatures w14:val="standardContextual"/>
         </w:rPr>
       </w:pPr>
-      <w:hyperlink w:anchor="_Toc243264495" w:history="1">
+      <w:hyperlink w:anchor="_Toc243267541" w:history="1">
         <w:r>
           <w:rPr>
             <w:rStyle w:val="Collegamentoipertestuale"/>
@@ -17242,7 +17242,7 @@
             <w:noProof/>
             <w:webHidden/>
           </w:rPr>
-          <w:instrText xml:space="preserve"> PAGEREF _Toc243264495 \h </w:instrText>
+          <w:instrText xml:space="preserve"> PAGEREF _Toc243267541 \h </w:instrText>
         </w:r>
         <w:r>
           <w:rPr>
@@ -17323,7 +17323,7 @@
         <w:keepNext/>
         <w:spacing w:after="140"/>
       </w:pPr>
-      <w:bookmarkStart w:id="2" w:name="_Toc243264334"/>
+      <w:bookmarkStart w:id="2" w:name="_Toc243267380"/>
       <w:r>
         <w:t>Spettri NTC e isolamento sismico</w:t>
       </w:r>
@@ -17343,7 +17343,7 @@
         <w:keepNext/>
         <w:spacing w:after="140"/>
       </w:pPr>
-      <w:bookmarkStart w:id="3" w:name="_Toc243264335"/>
+      <w:bookmarkStart w:id="3" w:name="_Toc243267381"/>
       <w:r>
         <w:t>Sito e spettri</w:t>
       </w:r>
@@ -17701,7 +17701,7 @@
         <w:keepNext/>
         <w:spacing w:after="140"/>
       </w:pPr>
-      <w:bookmarkStart w:id="4" w:name="_Toc243264336"/>
+      <w:bookmarkStart w:id="4" w:name="_Toc243267382"/>
       <w:r>
         <w:t>Isolatori e modello equivalente</w:t>
       </w:r>
@@ -17747,7 +17747,10 @@
         <w:spacing w:after="140"/>
       </w:pPr>
       <w:r>
-        <w:t>Il valore Sa campione Excel consente il confronto con la ricerca tabellare dell’esempio. Il risultato principale usa invece la valutazione analitica dello spettro esattamente a Tis. Nell’esempio, allo SLC, il campione vale circa 0,176284373 g, mentre Sa(Tis) vale 0,170127557 g: la conseguente differenza di forza e spostamento è esplicita. Oltre il campo dei campioni il confronto non è disponibile, mentre il calcolo analitico conserva la propria definizione.</w:t>
+        <w:t>Il valore Sa campione Excel consente il confronto con la ricerca tabellare dell’esempio. Il risultato principale usa invece la valutazione analitica dello spettro esattamente a Tis. Nell’esempio, allo SLC, il campione vale circa 0,176284373 g, mentre Sa(Tis) vale 0,170127557 g: la conseguente differenza di forza e spostamento è esplicita. Il calcolo richiede Tis non superiore a 4 s in ogni stato limite; oltre questo limite si interrompe, perché le NTC 2018 §3.2.3.2 richiedono una definizione specifica dell’</w:t>
+      </w:r>
+      <w:r>
+        <w:t>azione sismica.</w:t>
       </w:r>
     </w:p>
     <w:p>
@@ -17756,7 +17759,7 @@
         <w:keepNext/>
         <w:spacing w:after="140"/>
       </w:pPr>
-      <w:bookmarkStart w:id="5" w:name="_Toc243264337"/>
+      <w:bookmarkStart w:id="5" w:name="_Toc243267383"/>
       <w:r>
         <w:t>Pendolo e parametri assegnati</w:t>
       </w:r>
@@ -17797,7 +17800,7 @@
         <w:keepNext/>
         <w:spacing w:after="140"/>
       </w:pPr>
-      <w:bookmarkStart w:id="6" w:name="_Toc243264338"/>
+      <w:bookmarkStart w:id="6" w:name="_Toc243267384"/>
       <w:r>
         <w:t>Salvataggio e report</w:t>
       </w:r>
@@ -17825,7 +17828,7 @@
         <w:keepNext/>
         <w:spacing w:after="140"/>
       </w:pPr>
-      <w:bookmarkStart w:id="7" w:name="_Toc243264339"/>
+      <w:bookmarkStart w:id="7" w:name="_Toc243267385"/>
       <w:r>
         <w:t>Stratigrafia del terreno</w:t>
       </w:r>
@@ -17925,7 +17928,7 @@
         <w:keepNext/>
         <w:spacing w:after="140"/>
       </w:pPr>
-      <w:bookmarkStart w:id="8" w:name="_Toc243264340"/>
+      <w:bookmarkStart w:id="8" w:name="_Toc243267386"/>
       <w:r>
         <w:t>Famiglie di terreno e retini</w:t>
       </w:r>
@@ -17964,7 +17967,7 @@
         <w:keepNext/>
         <w:spacing w:after="140"/>
       </w:pPr>
-      <w:bookmarkStart w:id="9" w:name="_Toc243264341"/>
+      <w:bookmarkStart w:id="9" w:name="_Toc243267387"/>
       <w:r>
         <w:t>Valori medi e minimi</w:t>
       </w:r>
@@ -17995,7 +17998,7 @@
         <w:keepNext/>
         <w:spacing w:after="140"/>
       </w:pPr>
-      <w:bookmarkStart w:id="10" w:name="_Toc243264342"/>
+      <w:bookmarkStart w:id="10" w:name="_Toc243267388"/>
       <w:r>
         <w:lastRenderedPageBreak/>
         <w:t>Scambio del terreno fra fogli ANTHEA</w:t>
@@ -18046,7 +18049,7 @@
         <w:keepNext/>
         <w:spacing w:after="140"/>
       </w:pPr>
-      <w:bookmarkStart w:id="11" w:name="_Toc243264343"/>
+      <w:bookmarkStart w:id="11" w:name="_Toc243267389"/>
       <w:r>
         <w:t>Importazione assistita della relazione</w:t>
       </w:r>
@@ -18105,7 +18108,7 @@
         <w:keepNext/>
         <w:spacing w:after="140"/>
       </w:pPr>
-      <w:bookmarkStart w:id="12" w:name="_Toc243264344"/>
+      <w:bookmarkStart w:id="12" w:name="_Toc243267390"/>
       <w:r>
         <w:t>Avvio e scelta del modulo</w:t>
       </w:r>
@@ -18117,7 +18120,7 @@
         <w:keepNext/>
         <w:spacing w:after="140"/>
       </w:pPr>
-      <w:bookmarkStart w:id="13" w:name="_Toc243264345"/>
+      <w:bookmarkStart w:id="13" w:name="_Toc243267391"/>
       <w:r>
         <w:t>Avviare la versione aggiornata</w:t>
       </w:r>
@@ -18161,7 +18164,7 @@
         <w:keepNext/>
         <w:spacing w:after="140"/>
       </w:pPr>
-      <w:bookmarkStart w:id="14" w:name="_Toc243264346"/>
+      <w:bookmarkStart w:id="14" w:name="_Toc243267392"/>
       <w:r>
         <w:lastRenderedPageBreak/>
         <w:t>Scegliere l’aspetto</w:t>
@@ -18190,7 +18193,7 @@
         <w:keepNext/>
         <w:spacing w:after="140"/>
       </w:pPr>
-      <w:bookmarkStart w:id="15" w:name="_Toc243264347"/>
+      <w:bookmarkStart w:id="15" w:name="_Toc243267393"/>
       <w:r>
         <w:t>Scegliere il foglio adatto</w:t>
       </w:r>
@@ -19176,7 +19179,7 @@
         <w:keepNext/>
         <w:spacing w:after="140"/>
       </w:pPr>
-      <w:bookmarkStart w:id="16" w:name="_Toc243264348"/>
+      <w:bookmarkStart w:id="16" w:name="_Toc243267394"/>
       <w:r>
         <w:t>Leggere e compilare i campi</w:t>
       </w:r>
@@ -19212,7 +19215,7 @@
         <w:keepNext/>
         <w:spacing w:after="140"/>
       </w:pPr>
-      <w:bookmarkStart w:id="17" w:name="_Toc243264349"/>
+      <w:bookmarkStart w:id="17" w:name="_Toc243267395"/>
       <w:r>
         <w:t>Progetti e gestione del lavoro</w:t>
       </w:r>
@@ -19224,7 +19227,7 @@
         <w:keepNext/>
         <w:spacing w:after="140"/>
       </w:pPr>
-      <w:bookmarkStart w:id="18" w:name="_Toc243264350"/>
+      <w:bookmarkStart w:id="18" w:name="_Toc243267396"/>
       <w:r>
         <w:t>Costruire una struttura leggibile</w:t>
       </w:r>
@@ -19261,7 +19264,7 @@
         <w:keepNext/>
         <w:spacing w:after="140"/>
       </w:pPr>
-      <w:bookmarkStart w:id="19" w:name="_Toc243264351"/>
+      <w:bookmarkStart w:id="19" w:name="_Toc243267397"/>
       <w:r>
         <w:t>Comprendere i dati comuni</w:t>
       </w:r>
@@ -19308,7 +19311,7 @@
         <w:keepNext/>
         <w:spacing w:after="140"/>
       </w:pPr>
-      <w:bookmarkStart w:id="20" w:name="_Toc243264352"/>
+      <w:bookmarkStart w:id="20" w:name="_Toc243267398"/>
       <w:r>
         <w:t>Spostare duplicare e annullare</w:t>
       </w:r>
@@ -19348,7 +19351,7 @@
         <w:keepNext/>
         <w:spacing w:after="140"/>
       </w:pPr>
-      <w:bookmarkStart w:id="21" w:name="_Toc243264353"/>
+      <w:bookmarkStart w:id="21" w:name="_Toc243267399"/>
       <w:r>
         <w:t>Usare le revisioni</w:t>
       </w:r>
@@ -19384,7 +19387,7 @@
         <w:keepNext/>
         <w:spacing w:after="140"/>
       </w:pPr>
-      <w:bookmarkStart w:id="22" w:name="_Toc243264354"/>
+      <w:bookmarkStart w:id="22" w:name="_Toc243267400"/>
       <w:r>
         <w:t>Report del ramo e compatibilità degli archivi</w:t>
       </w:r>
@@ -19420,7 +19423,7 @@
         <w:keepNext/>
         <w:spacing w:after="140"/>
       </w:pPr>
-      <w:bookmarkStart w:id="23" w:name="_Toc243264355"/>
+      <w:bookmarkStart w:id="23" w:name="_Toc243267401"/>
       <w:r>
         <w:lastRenderedPageBreak/>
         <w:t>Controllo della condivisione</w:t>
@@ -19449,7 +19452,7 @@
         <w:keepNext/>
         <w:spacing w:after="140"/>
       </w:pPr>
-      <w:bookmarkStart w:id="24" w:name="_Toc243264356"/>
+      <w:bookmarkStart w:id="24" w:name="_Toc243267402"/>
       <w:r>
         <w:t>Materiali e durabilità</w:t>
       </w:r>
@@ -19461,7 +19464,7 @@
         <w:keepNext/>
         <w:spacing w:after="140"/>
       </w:pPr>
-      <w:bookmarkStart w:id="25" w:name="_Toc243264357"/>
+      <w:bookmarkStart w:id="25" w:name="_Toc243267403"/>
       <w:r>
         <w:t>Preparare il calcestruzzo</w:t>
       </w:r>
@@ -19505,7 +19508,7 @@
         <w:keepNext/>
         <w:spacing w:after="140"/>
       </w:pPr>
-      <w:bookmarkStart w:id="26" w:name="_Toc243264358"/>
+      <w:bookmarkStart w:id="26" w:name="_Toc243267404"/>
       <w:r>
         <w:t>Preparare l'acciaio per armature</w:t>
       </w:r>
@@ -19545,7 +19548,7 @@
         <w:keepNext/>
         <w:spacing w:after="140"/>
       </w:pPr>
-      <w:bookmarkStart w:id="27" w:name="_Toc243264359"/>
+      <w:bookmarkStart w:id="27" w:name="_Toc243267405"/>
       <w:r>
         <w:t>Palo verticale</w:t>
       </w:r>
@@ -19557,7 +19560,7 @@
         <w:keepNext/>
         <w:spacing w:after="140"/>
       </w:pPr>
-      <w:bookmarkStart w:id="28" w:name="_Toc243264360"/>
+      <w:bookmarkStart w:id="28" w:name="_Toc243267406"/>
       <w:r>
         <w:t>Compilazione ordinata</w:t>
       </w:r>
@@ -19622,7 +19625,7 @@
         <w:keepNext/>
         <w:spacing w:after="140"/>
       </w:pPr>
-      <w:bookmarkStart w:id="29" w:name="_Toc243264361"/>
+      <w:bookmarkStart w:id="29" w:name="_Toc243267407"/>
       <w:r>
         <w:t>Coefficienti e gruppo di pali</w:t>
       </w:r>
@@ -19669,7 +19672,7 @@
         <w:keepNext/>
         <w:spacing w:after="140"/>
       </w:pPr>
-      <w:bookmarkStart w:id="30" w:name="_Toc243264362"/>
+      <w:bookmarkStart w:id="30" w:name="_Toc243267408"/>
       <w:r>
         <w:t>Leggere i risultati</w:t>
       </w:r>
@@ -19705,7 +19708,7 @@
         <w:keepNext/>
         <w:spacing w:after="140"/>
       </w:pPr>
-      <w:bookmarkStart w:id="31" w:name="_Toc243264363"/>
+      <w:bookmarkStart w:id="31" w:name="_Toc243267409"/>
       <w:r>
         <w:t>Esempio di controllo manuale</w:t>
       </w:r>
@@ -19796,7 +19799,7 @@
         <w:keepNext/>
         <w:spacing w:after="140"/>
       </w:pPr>
-      <w:bookmarkStart w:id="32" w:name="_Toc243264364"/>
+      <w:bookmarkStart w:id="32" w:name="_Toc243267410"/>
       <w:r>
         <w:t>Micropalo verticale</w:t>
       </w:r>
@@ -19808,7 +19811,7 @@
         <w:keepNext/>
         <w:spacing w:after="140"/>
       </w:pPr>
-      <w:bookmarkStart w:id="33" w:name="_Toc243264365"/>
+      <w:bookmarkStart w:id="33" w:name="_Toc243267411"/>
       <w:r>
         <w:t>Dati del bulbo e dell'iniezione</w:t>
       </w:r>
@@ -19854,7 +19857,7 @@
         <w:keepNext/>
         <w:spacing w:after="140"/>
       </w:pPr>
-      <w:bookmarkStart w:id="34" w:name="_Toc243264366"/>
+      <w:bookmarkStart w:id="34" w:name="_Toc243267412"/>
       <w:r>
         <w:t>Tubo e peso</w:t>
       </w:r>
@@ -19891,7 +19894,7 @@
         <w:keepNext/>
         <w:spacing w:after="140"/>
       </w:pPr>
-      <w:bookmarkStart w:id="35" w:name="_Toc243264367"/>
+      <w:bookmarkStart w:id="35" w:name="_Toc243267413"/>
       <w:r>
         <w:t>Pali e micropali caricati orizzontalmente</w:t>
       </w:r>
@@ -19903,7 +19906,7 @@
         <w:keepNext/>
         <w:spacing w:after="140"/>
       </w:pPr>
-      <w:bookmarkStart w:id="36" w:name="_Toc243264368"/>
+      <w:bookmarkStart w:id="36" w:name="_Toc243267414"/>
       <w:r>
         <w:t>Preparare un modello coerente</w:t>
       </w:r>
@@ -19942,7 +19945,7 @@
         <w:keepNext/>
         <w:spacing w:after="140"/>
       </w:pPr>
-      <w:bookmarkStart w:id="37" w:name="_Toc243264369"/>
+      <w:bookmarkStart w:id="37" w:name="_Toc243267415"/>
       <w:r>
         <w:lastRenderedPageBreak/>
         <w:t>Momento resistente del palo in calcestruzzo</w:t>
@@ -19971,7 +19974,7 @@
         <w:keepNext/>
         <w:spacing w:after="140"/>
       </w:pPr>
-      <w:bookmarkStart w:id="38" w:name="_Toc243264370"/>
+      <w:bookmarkStart w:id="38" w:name="_Toc243267416"/>
       <w:r>
         <w:t>Sezione CHS del micropalo</w:t>
       </w:r>
@@ -19999,7 +20002,7 @@
         <w:keepNext/>
         <w:spacing w:after="140"/>
       </w:pPr>
-      <w:bookmarkStart w:id="39" w:name="_Toc243264371"/>
+      <w:bookmarkStart w:id="39" w:name="_Toc243267417"/>
       <w:r>
         <w:t>Interpretare diagrammi e capacità</w:t>
       </w:r>
@@ -20027,7 +20030,7 @@
         <w:keepNext/>
         <w:spacing w:after="140"/>
       </w:pPr>
-      <w:bookmarkStart w:id="40" w:name="_Toc243264372"/>
+      <w:bookmarkStart w:id="40" w:name="_Toc243267418"/>
       <w:r>
         <w:t>Separare tubo e diametro geotecnico</w:t>
       </w:r>
@@ -20064,7 +20067,7 @@
         <w:keepNext/>
         <w:spacing w:after="140"/>
       </w:pPr>
-      <w:bookmarkStart w:id="41" w:name="_Toc243264373"/>
+      <w:bookmarkStart w:id="41" w:name="_Toc243267419"/>
       <w:r>
         <w:t>Sezione composta da ponte</w:t>
       </w:r>
@@ -20076,7 +20079,7 @@
         <w:keepNext/>
         <w:spacing w:after="140"/>
       </w:pPr>
-      <w:bookmarkStart w:id="42" w:name="_Toc243264374"/>
+      <w:bookmarkStart w:id="42" w:name="_Toc243267420"/>
       <w:r>
         <w:t>Definire la sezione locale</w:t>
       </w:r>
@@ -20123,7 +20126,7 @@
         <w:keepNext/>
         <w:spacing w:after="140"/>
       </w:pPr>
-      <w:bookmarkStart w:id="43" w:name="_Toc243264375"/>
+      <w:bookmarkStart w:id="43" w:name="_Toc243267421"/>
       <w:r>
         <w:t>Compilare la sezione con anima inclinata</w:t>
       </w:r>
@@ -20162,7 +20165,7 @@
           <w:noProof/>
         </w:rPr>
         <w:drawing>
-          <wp:inline distT="0" distB="0" distL="0" distR="0" wp14:anchorId="306FB1F8" wp14:editId="480B4817">
+          <wp:inline distT="0" distB="0" distL="0" distR="0" wp14:anchorId="3ABCBD62" wp14:editId="75BA2E2B">
             <wp:extent cx="6120000" cy="3677403"/>
             <wp:effectExtent l="0" t="0" r="0" b="0"/>
             <wp:docPr id="1" name="Picture 1" descr="H con anima inclinata e scostamento positivo di 300 mm"/>
@@ -20220,7 +20223,7 @@
         <w:keepNext/>
         <w:spacing w:after="140"/>
       </w:pPr>
-      <w:bookmarkStart w:id="44" w:name="_Toc243264376"/>
+      <w:bookmarkStart w:id="44" w:name="_Toc243267422"/>
       <w:r>
         <w:t>Compilare il cassoncino</w:t>
       </w:r>
@@ -20261,7 +20264,7 @@
           <w:noProof/>
         </w:rPr>
         <w:drawing>
-          <wp:inline distT="0" distB="0" distL="0" distR="0" wp14:anchorId="73D981C1" wp14:editId="7A53BC6D">
+          <wp:inline distT="0" distB="0" distL="0" distR="0" wp14:anchorId="028A1219" wp14:editId="05E500E8">
             <wp:extent cx="6120000" cy="3677403"/>
             <wp:effectExtent l="0" t="0" r="0" b="0"/>
             <wp:docPr id="2" name="Picture 2" descr="Cassoncino con due anime inclinate e due piattabande superiori"/>
@@ -20322,7 +20325,7 @@
         <w:keepNext/>
         <w:spacing w:after="140"/>
       </w:pPr>
-      <w:bookmarkStart w:id="45" w:name="_Toc243264377"/>
+      <w:bookmarkStart w:id="45" w:name="_Toc243267423"/>
       <w:r>
         <w:lastRenderedPageBreak/>
         <w:t>Leggere le proprietà e riconoscere i limiti</w:t>
@@ -20807,7 +20810,7 @@
         <w:keepNext/>
         <w:spacing w:after="140"/>
       </w:pPr>
-      <w:bookmarkStart w:id="46" w:name="_Toc243264378"/>
+      <w:bookmarkStart w:id="46" w:name="_Toc243267424"/>
       <w:r>
         <w:t>Scegliere consapevolmente il metodo</w:t>
       </w:r>
@@ -21183,7 +21186,7 @@
         <w:keepNext/>
         <w:spacing w:after="140"/>
       </w:pPr>
-      <w:bookmarkStart w:id="47" w:name="_Toc243264379"/>
+      <w:bookmarkStart w:id="47" w:name="_Toc243267425"/>
       <w:r>
         <w:t>Costruire le fasi</w:t>
       </w:r>
@@ -21240,7 +21243,7 @@
         <w:keepNext/>
         <w:spacing w:after="140"/>
       </w:pPr>
-      <w:bookmarkStart w:id="48" w:name="_Toc243264380"/>
+      <w:bookmarkStart w:id="48" w:name="_Toc243267426"/>
       <w:r>
         <w:t>Leggere efficacia tensioni e controlli locali</w:t>
       </w:r>
@@ -21328,7 +21331,7 @@
         <w:keepNext/>
         <w:spacing w:after="140"/>
       </w:pPr>
-      <w:bookmarkStart w:id="49" w:name="_Toc243264381"/>
+      <w:bookmarkStart w:id="49" w:name="_Toc243267427"/>
       <w:r>
         <w:t>Torsione distorsione e diaframmi del cassoncino</w:t>
       </w:r>
@@ -21407,7 +21410,7 @@
           <w:noProof/>
         </w:rPr>
         <w:drawing>
-          <wp:inline distT="0" distB="0" distL="0" distR="0" wp14:anchorId="7970906A" wp14:editId="6E612538">
+          <wp:inline distT="0" distB="0" distL="0" distR="0" wp14:anchorId="3D60841F" wp14:editId="3AB980CE">
             <wp:extent cx="6120000" cy="3677403"/>
             <wp:effectExtent l="0" t="0" r="0" b="0"/>
             <wp:docPr id="3" name="Picture 3" descr="Riquadro delle verifiche a torsione del cassoncino"/>
@@ -21482,7 +21485,7 @@
           <w:noProof/>
         </w:rPr>
         <w:drawing>
-          <wp:inline distT="0" distB="0" distL="0" distR="0" wp14:anchorId="1FDDD925" wp14:editId="1CE02767">
+          <wp:inline distT="0" distB="0" distL="0" distR="0" wp14:anchorId="798F2A6F" wp14:editId="045BEF18">
             <wp:extent cx="6120000" cy="3677403"/>
             <wp:effectExtent l="0" t="0" r="0" b="0"/>
             <wp:docPr id="4" name="Picture 4" descr="Flussi di torsione per fase nella scheda Verifiche"/>
@@ -21566,7 +21569,7 @@
         <w:keepNext/>
         <w:spacing w:after="140"/>
       </w:pPr>
-      <w:bookmarkStart w:id="50" w:name="_Toc243264382"/>
+      <w:bookmarkStart w:id="50" w:name="_Toc243267428"/>
       <w:r>
         <w:t>Curve di risposta</w:t>
       </w:r>
@@ -21621,7 +21624,7 @@
         <w:keepNext/>
         <w:spacing w:after="140"/>
       </w:pPr>
-      <w:bookmarkStart w:id="51" w:name="_Toc243264383"/>
+      <w:bookmarkStart w:id="51" w:name="_Toc243267429"/>
       <w:r>
         <w:t>Bridge Design</w:t>
       </w:r>
@@ -21649,7 +21652,7 @@
         <w:keepNext/>
         <w:spacing w:after="140"/>
       </w:pPr>
-      <w:bookmarkStart w:id="52" w:name="_Toc243264384"/>
+      <w:bookmarkStart w:id="52" w:name="_Toc243267430"/>
       <w:r>
         <w:t>Preparare i dati prima di aprire la ricerca</w:t>
       </w:r>
@@ -22331,7 +22334,7 @@
         <w:keepNext/>
         <w:spacing w:after="140"/>
       </w:pPr>
-      <w:bookmarkStart w:id="53" w:name="_Toc243264385"/>
+      <w:bookmarkStart w:id="53" w:name="_Toc243267431"/>
       <w:r>
         <w:t>Creare il progetto di riferimento</w:t>
       </w:r>
@@ -22431,7 +22434,7 @@
         <w:keepNext/>
         <w:spacing w:after="140"/>
       </w:pPr>
-      <w:bookmarkStart w:id="54" w:name="_Toc243264386"/>
+      <w:bookmarkStart w:id="54" w:name="_Toc243267432"/>
       <w:r>
         <w:lastRenderedPageBreak/>
         <w:t>Scegliere e cambiare prezzario</w:t>
@@ -22521,7 +22524,7 @@
         <w:keepNext/>
         <w:spacing w:after="140"/>
       </w:pPr>
-      <w:bookmarkStart w:id="55" w:name="_Toc243264387"/>
+      <w:bookmarkStart w:id="55" w:name="_Toc243267433"/>
       <w:r>
         <w:t>Impostare il traffico del ponte</w:t>
       </w:r>
@@ -22558,7 +22561,7 @@
         <w:keepNext/>
         <w:spacing w:after="140"/>
       </w:pPr>
-      <w:bookmarkStart w:id="56" w:name="_Toc243264388"/>
+      <w:bookmarkStart w:id="56" w:name="_Toc243267434"/>
       <w:r>
         <w:t>Leggere sezioni spessori e lunghezze</w:t>
       </w:r>
@@ -22603,7 +22606,7 @@
         <w:keepNext/>
         <w:spacing w:after="140"/>
       </w:pPr>
-      <w:bookmarkStart w:id="57" w:name="_Toc243264389"/>
+      <w:bookmarkStart w:id="57" w:name="_Toc243267435"/>
       <w:r>
         <w:t>Scegliere obiettivo e costanti</w:t>
       </w:r>
@@ -23292,7 +23295,7 @@
         <w:keepNext/>
         <w:spacing w:after="140"/>
       </w:pPr>
-      <w:bookmarkStart w:id="58" w:name="_Toc243264390"/>
+      <w:bookmarkStart w:id="58" w:name="_Toc243267436"/>
       <w:r>
         <w:lastRenderedPageBreak/>
         <w:t>Impostare range utili</w:t>
@@ -23345,7 +23348,7 @@
         <w:keepNext/>
         <w:spacing w:after="140"/>
       </w:pPr>
-      <w:bookmarkStart w:id="59" w:name="_Toc243264391"/>
+      <w:bookmarkStart w:id="59" w:name="_Toc243267437"/>
       <w:r>
         <w:t>Avviare e leggere l’avanzamento</w:t>
       </w:r>
@@ -23381,7 +23384,7 @@
         <w:keepNext/>
         <w:spacing w:after="140"/>
       </w:pPr>
-      <w:bookmarkStart w:id="60" w:name="_Toc243264392"/>
+      <w:bookmarkStart w:id="60" w:name="_Toc243267438"/>
       <w:r>
         <w:lastRenderedPageBreak/>
         <w:t>Usare i grafici</w:t>
@@ -23422,7 +23425,7 @@
           <w:noProof/>
         </w:rPr>
         <w:drawing>
-          <wp:inline distT="0" distB="0" distL="0" distR="0" wp14:anchorId="5E544E6B" wp14:editId="63513AF5">
+          <wp:inline distT="0" distB="0" distL="0" distR="0" wp14:anchorId="55F02E7B" wp14:editId="7A33F873">
             <wp:extent cx="6120000" cy="3519000"/>
             <wp:effectExtent l="0" t="0" r="0" b="0"/>
             <wp:docPr id="5" name="Picture 5" descr="Nuvola costo e CO₂ ricavata dai risultati riproducibili dell’esempio"/>
@@ -23485,7 +23488,7 @@
         </w:rPr>
         <w:lastRenderedPageBreak/>
         <w:drawing>
-          <wp:inline distT="0" distB="0" distL="0" distR="0" wp14:anchorId="3E4FABE9" wp14:editId="1182DA7F">
+          <wp:inline distT="0" distB="0" distL="0" distR="0" wp14:anchorId="36CF56D4" wp14:editId="4B42D104">
             <wp:extent cx="6120000" cy="3519000"/>
             <wp:effectExtent l="0" t="0" r="0" b="0"/>
             <wp:docPr id="6" name="Picture 6" descr="Variazione di altezza e costo durante l’enumerazione dell’esempio"/>
@@ -23535,7 +23538,7 @@
         <w:keepNext/>
         <w:spacing w:after="140"/>
       </w:pPr>
-      <w:bookmarkStart w:id="61" w:name="_Toc243264393"/>
+      <w:bookmarkStart w:id="61" w:name="_Toc243267439"/>
       <w:r>
         <w:t>Esempio guidato da centoventi metri</w:t>
       </w:r>
@@ -24275,7 +24278,7 @@
           <w:noProof/>
         </w:rPr>
         <w:drawing>
-          <wp:inline distT="0" distB="0" distL="0" distR="0" wp14:anchorId="6404ED3C" wp14:editId="2C0E125B">
+          <wp:inline distT="0" distB="0" distL="0" distR="0" wp14:anchorId="5D5963AA" wp14:editId="49514919">
             <wp:extent cx="6120000" cy="2601000"/>
             <wp:effectExtent l="0" t="0" r="0" b="0"/>
             <wp:docPr id="7" name="Picture 7" descr="Differenze di costo fra il riferimento e alcuni scenari dell’esempio"/>
@@ -24345,7 +24348,7 @@
         <w:keepNext/>
         <w:spacing w:after="140"/>
       </w:pPr>
-      <w:bookmarkStart w:id="62" w:name="_Toc243264394"/>
+      <w:bookmarkStart w:id="62" w:name="_Toc243267440"/>
       <w:r>
         <w:t>Selezionare applicare e conservare le alternative</w:t>
       </w:r>
@@ -24389,7 +24392,7 @@
         <w:keepNext/>
         <w:spacing w:after="140"/>
       </w:pPr>
-      <w:bookmarkStart w:id="63" w:name="_Toc243264395"/>
+      <w:bookmarkStart w:id="63" w:name="_Toc243267441"/>
       <w:r>
         <w:t>Prezzi geotecnica e scenari da confrontare</w:t>
       </w:r>
@@ -24426,7 +24429,7 @@
         <w:keepNext/>
         <w:spacing w:after="140"/>
       </w:pPr>
-      <w:bookmarkStart w:id="64" w:name="_Toc243264396"/>
+      <w:bookmarkStart w:id="64" w:name="_Toc243267442"/>
       <w:r>
         <w:t>Usare le famiglie speciali</w:t>
       </w:r>
@@ -24470,7 +24473,7 @@
         <w:keepNext/>
         <w:spacing w:after="140"/>
       </w:pPr>
-      <w:bookmarkStart w:id="65" w:name="_Toc243264397"/>
+      <w:bookmarkStart w:id="65" w:name="_Toc243267443"/>
       <w:r>
         <w:t>Risolvere i messaggi più comuni</w:t>
       </w:r>
@@ -25378,7 +25381,7 @@
         <w:keepNext/>
         <w:spacing w:after="140"/>
       </w:pPr>
-      <w:bookmarkStart w:id="66" w:name="_Toc243264398"/>
+      <w:bookmarkStart w:id="66" w:name="_Toc243267444"/>
       <w:r>
         <w:t>Esportare un confronto leggibile</w:t>
       </w:r>
@@ -25406,7 +25409,7 @@
         <w:keepNext/>
         <w:spacing w:after="140"/>
       </w:pPr>
-      <w:bookmarkStart w:id="67" w:name="_Toc243264399"/>
+      <w:bookmarkStart w:id="67" w:name="_Toc243267445"/>
       <w:r>
         <w:t>Quanto fidarsi dei risultati</w:t>
       </w:r>
@@ -25443,7 +25446,7 @@
         <w:keepNext/>
         <w:spacing w:after="140"/>
       </w:pPr>
-      <w:bookmarkStart w:id="68" w:name="_Toc243264400"/>
+      <w:bookmarkStart w:id="68" w:name="_Toc243267446"/>
       <w:r>
         <w:t>Salvataggio e report</w:t>
       </w:r>
@@ -25455,7 +25458,7 @@
         <w:keepNext/>
         <w:spacing w:after="140"/>
       </w:pPr>
-      <w:bookmarkStart w:id="69" w:name="_Toc243264401"/>
+      <w:bookmarkStart w:id="69" w:name="_Toc243267447"/>
       <w:r>
         <w:t>Conservare dati modificabili</w:t>
       </w:r>
@@ -25483,7 +25486,7 @@
         <w:keepNext/>
         <w:spacing w:after="140"/>
       </w:pPr>
-      <w:bookmarkStart w:id="70" w:name="_Toc243264402"/>
+      <w:bookmarkStart w:id="70" w:name="_Toc243267448"/>
       <w:r>
         <w:t>Report del singolo foglio e del progetto</w:t>
       </w:r>
@@ -25527,7 +25530,7 @@
         <w:keepNext/>
         <w:spacing w:after="140"/>
       </w:pPr>
-      <w:bookmarkStart w:id="71" w:name="_Toc243264403"/>
+      <w:bookmarkStart w:id="71" w:name="_Toc243267449"/>
       <w:r>
         <w:t>Ricalcolo e proposte da applicare</w:t>
       </w:r>
@@ -25575,7 +25578,7 @@
         <w:keepNext/>
         <w:spacing w:after="140"/>
       </w:pPr>
-      <w:bookmarkStart w:id="72" w:name="_Toc243264404"/>
+      <w:bookmarkStart w:id="72" w:name="_Toc243267450"/>
       <w:r>
         <w:t>Conservare dati e risultati insieme</w:t>
       </w:r>
@@ -25603,7 +25606,7 @@
         <w:keepNext/>
         <w:spacing w:after="140"/>
       </w:pPr>
-      <w:bookmarkStart w:id="73" w:name="_Toc243264405"/>
+      <w:bookmarkStart w:id="73" w:name="_Toc243267451"/>
       <w:r>
         <w:t>Percorso completo per un primo progetto</w:t>
       </w:r>
@@ -25687,7 +25690,7 @@
         <w:keepNext/>
         <w:spacing w:after="140"/>
       </w:pPr>
-      <w:bookmarkStart w:id="74" w:name="_Toc243264406"/>
+      <w:bookmarkStart w:id="74" w:name="_Toc243267452"/>
       <w:r>
         <w:t>Problemi frequenti e controlli finali</w:t>
       </w:r>
@@ -26273,7 +26276,7 @@
         <w:keepNext/>
         <w:spacing w:after="140"/>
       </w:pPr>
-      <w:bookmarkStart w:id="75" w:name="_Toc243264407"/>
+      <w:bookmarkStart w:id="75" w:name="_Toc243267453"/>
       <w:r>
         <w:t>Riferimenti per approfondire</w:t>
       </w:r>
@@ -26297,7 +26300,7 @@
         <w:keepNext/>
         <w:spacing w:after="140"/>
       </w:pPr>
-      <w:bookmarkStart w:id="76" w:name="_Toc243264408"/>
+      <w:bookmarkStart w:id="76" w:name="_Toc243267454"/>
       <w:r>
         <w:t>Muri di sostegno con stratigrafie di monte e valle</w:t>
       </w:r>
@@ -26376,7 +26379,7 @@
         <w:keepNext/>
         <w:spacing w:after="140"/>
       </w:pPr>
-      <w:bookmarkStart w:id="77" w:name="_Toc243264409"/>
+      <w:bookmarkStart w:id="77" w:name="_Toc243267455"/>
       <w:r>
         <w:lastRenderedPageBreak/>
         <w:t>Materiali e copriferro del muro</w:t>
@@ -26452,7 +26455,7 @@
         <w:keepNext/>
         <w:spacing w:after="140"/>
       </w:pPr>
-      <w:bookmarkStart w:id="78" w:name="_Toc243264410"/>
+      <w:bookmarkStart w:id="78" w:name="_Toc243267456"/>
       <w:r>
         <w:t>Avviare la verifica globale</w:t>
       </w:r>
@@ -26503,7 +26506,7 @@
         <w:keepNext/>
         <w:spacing w:after="140"/>
       </w:pPr>
-      <w:bookmarkStart w:id="79" w:name="_Toc243264411"/>
+      <w:bookmarkStart w:id="79" w:name="_Toc243267457"/>
       <w:r>
         <w:t>Inserire spessori e proprietà dei terreni</w:t>
       </w:r>
@@ -27224,7 +27227,7 @@
         </w:rPr>
         <w:lastRenderedPageBreak/>
         <w:drawing>
-          <wp:inline distT="0" distB="0" distL="0" distR="0" wp14:anchorId="32E2F4B1" wp14:editId="47D1F6A7">
+          <wp:inline distT="0" distB="0" distL="0" distR="0" wp14:anchorId="4E6E23D7" wp14:editId="7261CE30">
             <wp:extent cx="6120000" cy="2570400"/>
             <wp:effectExtent l="0" t="0" r="0" b="0"/>
             <wp:docPr id="8" name="Picture 8" descr="Profilo dell’esempio stratificato con terreno sotto la fondazione e limiti di ricerca evidenziati in blu."/>
@@ -27282,7 +27285,7 @@
         <w:keepNext/>
         <w:spacing w:after="140"/>
       </w:pPr>
-      <w:bookmarkStart w:id="80" w:name="_Toc243264412"/>
+      <w:bookmarkStart w:id="80" w:name="_Toc243267458"/>
       <w:r>
         <w:t>Controllare rilievo falda sisma e ricerca</w:t>
       </w:r>
@@ -27327,7 +27330,7 @@
         <w:keepNext/>
         <w:spacing w:after="140"/>
       </w:pPr>
-      <w:bookmarkStart w:id="81" w:name="_Toc243264413"/>
+      <w:bookmarkStart w:id="81" w:name="_Toc243267459"/>
       <w:r>
         <w:t>Leggere il risultato e riprodurre l’esempio</w:t>
       </w:r>
@@ -27429,7 +27432,7 @@
         <w:keepNext/>
         <w:spacing w:after="140"/>
       </w:pPr>
-      <w:bookmarkStart w:id="82" w:name="_Toc243264414"/>
+      <w:bookmarkStart w:id="82" w:name="_Toc243267460"/>
       <w:r>
         <w:t>Esempio salvato e risultati ripercorribili</w:t>
       </w:r>
@@ -27885,7 +27888,7 @@
         </w:rPr>
         <w:lastRenderedPageBreak/>
         <w:drawing>
-          <wp:inline distT="0" distB="0" distL="0" distR="0" wp14:anchorId="5CF04207" wp14:editId="0821ECD3">
+          <wp:inline distT="0" distB="0" distL="0" distR="0" wp14:anchorId="2D2FF489" wp14:editId="23C4F13B">
             <wp:extent cx="6120000" cy="2570400"/>
             <wp:effectExtent l="0" t="0" r="0" b="0"/>
             <wp:docPr id="9" name="Picture 9" descr="Superficie della seconda combinazione: il tasso supera 1 e il cerchio è rosso. L’esempio conserva l’esito sfavorevole per mostrare la lettura della verifica."/>
@@ -27952,7 +27955,7 @@
         <w:keepNext/>
         <w:spacing w:after="140"/>
       </w:pPr>
-      <w:bookmarkStart w:id="83" w:name="_Toc243264415"/>
+      <w:bookmarkStart w:id="83" w:name="_Toc243267461"/>
       <w:r>
         <w:t>Portanza, cedimenti e armature dei muri: procedura</w:t>
       </w:r>
@@ -27972,7 +27975,7 @@
         <w:keepNext/>
         <w:spacing w:after="140"/>
       </w:pPr>
-      <w:bookmarkStart w:id="84" w:name="_Toc243264416"/>
+      <w:bookmarkStart w:id="84" w:name="_Toc243267462"/>
       <w:r>
         <w:t>Scegliere il controllo</w:t>
       </w:r>
@@ -28481,7 +28484,7 @@
         <w:keepNext/>
         <w:spacing w:after="140"/>
       </w:pPr>
-      <w:bookmarkStart w:id="85" w:name="_Toc243264417"/>
+      <w:bookmarkStart w:id="85" w:name="_Toc243267463"/>
       <w:r>
         <w:t>Procedura e lettura</w:t>
       </w:r>
@@ -28517,7 +28520,7 @@
         <w:keepNext/>
         <w:spacing w:after="140"/>
       </w:pPr>
-      <w:bookmarkStart w:id="86" w:name="_Toc243264418"/>
+      <w:bookmarkStart w:id="86" w:name="_Toc243267464"/>
       <w:r>
         <w:t>Dati della portanza sismica</w:t>
       </w:r>
@@ -28590,7 +28593,7 @@
         <w:keepNext/>
         <w:spacing w:after="140"/>
       </w:pPr>
-      <w:bookmarkStart w:id="87" w:name="_Toc243264419"/>
+      <w:bookmarkStart w:id="87" w:name="_Toc243267465"/>
       <w:r>
         <w:t>Dati dei cedimenti</w:t>
       </w:r>
@@ -28627,7 +28630,7 @@
         <w:keepNext/>
         <w:spacing w:after="140"/>
       </w:pPr>
-      <w:bookmarkStart w:id="88" w:name="_Toc243264420"/>
+      <w:bookmarkStart w:id="88" w:name="_Toc243267466"/>
       <w:r>
         <w:t>Importare una storia Newmark</w:t>
       </w:r>
@@ -28659,7 +28662,7 @@
         <w:keepNext/>
         <w:spacing w:after="140"/>
       </w:pPr>
-      <w:bookmarkStart w:id="89" w:name="_Toc243264421"/>
+      <w:bookmarkStart w:id="89" w:name="_Toc243267467"/>
       <w:r>
         <w:t>Disporre e proporre le armature</w:t>
       </w:r>
@@ -28709,7 +28712,7 @@
         <w:keepNext/>
         <w:spacing w:after="140"/>
       </w:pPr>
-      <w:bookmarkStart w:id="90" w:name="_Toc243264422"/>
+      <w:bookmarkStart w:id="90" w:name="_Toc243267468"/>
       <w:r>
         <w:t>Tavola delle armature e distinta ferri del muro</w:t>
       </w:r>
@@ -28761,7 +28764,7 @@
           <w:noProof/>
         </w:rPr>
         <w:drawing>
-          <wp:inline distT="0" distB="0" distL="0" distR="0" wp14:anchorId="18870BCF" wp14:editId="0FDCBDAC">
+          <wp:inline distT="0" distB="0" distL="0" distR="0" wp14:anchorId="55672685" wp14:editId="713D9E18">
             <wp:extent cx="6120000" cy="4316786"/>
             <wp:effectExtent l="0" t="0" r="0" b="0"/>
             <wp:docPr id="10" name="Picture 10" descr="Esempio di distinta del muro con due zone di armatura e tratto di quattro metri"/>
@@ -28823,7 +28826,7 @@
         <w:keepNext/>
         <w:spacing w:after="140"/>
       </w:pPr>
-      <w:bookmarkStart w:id="91" w:name="_Toc243264423"/>
+      <w:bookmarkStart w:id="91" w:name="_Toc243267469"/>
       <w:r>
         <w:t>Efficienza orizzontale della palificata</w:t>
       </w:r>
@@ -28843,7 +28846,7 @@
         <w:keepNext/>
         <w:spacing w:after="140"/>
       </w:pPr>
-      <w:bookmarkStart w:id="92" w:name="_Toc243264424"/>
+      <w:bookmarkStart w:id="92" w:name="_Toc243267470"/>
       <w:r>
         <w:t>Apertura e geometria</w:t>
       </w:r>
@@ -28882,7 +28885,7 @@
         <w:keepNext/>
         <w:spacing w:after="140"/>
       </w:pPr>
-      <w:bookmarkStart w:id="93" w:name="_Toc243264425"/>
+      <w:bookmarkStart w:id="93" w:name="_Toc243267471"/>
       <w:r>
         <w:t>Metodo e applicabilità</w:t>
       </w:r>
@@ -29500,7 +29503,7 @@
         <w:keepNext/>
         <w:spacing w:after="140"/>
       </w:pPr>
-      <w:bookmarkStart w:id="94" w:name="_Toc243264426"/>
+      <w:bookmarkStart w:id="94" w:name="_Toc243267472"/>
       <w:r>
         <w:t>Risultati e confronto</w:t>
       </w:r>
@@ -29548,7 +29551,7 @@
         <w:keepNext/>
         <w:spacing w:after="140"/>
       </w:pPr>
-      <w:bookmarkStart w:id="95" w:name="_Toc243264427"/>
+      <w:bookmarkStart w:id="95" w:name="_Toc243267473"/>
       <w:r>
         <w:t>Risposta elastica del palo orizzontale</w:t>
       </w:r>
@@ -29568,7 +29571,7 @@
         <w:keepNext/>
         <w:spacing w:after="140"/>
       </w:pPr>
-      <w:bookmarkStart w:id="96" w:name="_Toc243264428"/>
+      <w:bookmarkStart w:id="96" w:name="_Toc243267474"/>
       <w:r>
         <w:t>Dati iniziali condivisi</w:t>
       </w:r>
@@ -29625,7 +29628,7 @@
         <w:keepNext/>
         <w:spacing w:after="140"/>
       </w:pPr>
-      <w:bookmarkStart w:id="97" w:name="_Toc243264429"/>
+      <w:bookmarkStart w:id="97" w:name="_Toc243267475"/>
       <w:r>
         <w:t>Parametri nella riga dello strato</w:t>
       </w:r>
@@ -29673,7 +29676,7 @@
         <w:keepNext/>
         <w:spacing w:after="140"/>
       </w:pPr>
-      <w:bookmarkStart w:id="98" w:name="_Toc243264430"/>
+      <w:bookmarkStart w:id="98" w:name="_Toc243267476"/>
       <w:r>
         <w:t>Sforzo normale e lettura dei diagrammi</w:t>
       </w:r>
@@ -29710,7 +29713,7 @@
         <w:keepNext/>
         <w:spacing w:after="140"/>
       </w:pPr>
-      <w:bookmarkStart w:id="99" w:name="_Toc243264431"/>
+      <w:bookmarkStart w:id="99" w:name="_Toc243267477"/>
       <w:r>
         <w:lastRenderedPageBreak/>
         <w:t>Materiali e parametri per strato</w:t>
@@ -29779,7 +29782,7 @@
         <w:keepNext/>
         <w:spacing w:after="140"/>
       </w:pPr>
-      <w:bookmarkStart w:id="100" w:name="_Toc243264432"/>
+      <w:bookmarkStart w:id="100" w:name="_Toc243267478"/>
       <w:r>
         <w:t>Avanzamento e controlli da completare</w:t>
       </w:r>
@@ -29830,7 +29833,7 @@
         <w:keepNext/>
         <w:spacing w:after="140"/>
       </w:pPr>
-      <w:bookmarkStart w:id="101" w:name="_Toc243264433"/>
+      <w:bookmarkStart w:id="101" w:name="_Toc243267479"/>
       <w:r>
         <w:t>Tratti colorati e verificatore della sezione</w:t>
       </w:r>
@@ -29910,7 +29913,7 @@
         <w:keepNext/>
         <w:spacing w:after="140"/>
       </w:pPr>
-      <w:bookmarkStart w:id="102" w:name="_Toc243264434"/>
+      <w:bookmarkStart w:id="102" w:name="_Toc243267480"/>
       <w:r>
         <w:t>Approvazione delle ipotesi ed esito delle armature</w:t>
       </w:r>
@@ -29972,7 +29975,7 @@
         <w:keepNext/>
         <w:spacing w:after="140"/>
       </w:pPr>
-      <w:bookmarkStart w:id="103" w:name="_Toc243264435"/>
+      <w:bookmarkStart w:id="103" w:name="_Toc243267481"/>
       <w:r>
         <w:t>Controlli sismici della testa del palo</w:t>
       </w:r>
@@ -30060,7 +30063,7 @@
         <w:keepNext/>
         <w:spacing w:after="140"/>
       </w:pPr>
-      <w:bookmarkStart w:id="104" w:name="_Toc243264436"/>
+      <w:bookmarkStart w:id="104" w:name="_Toc243267482"/>
       <w:r>
         <w:t>Ricalcolo delle sollecitazioni e delle resistenze</w:t>
       </w:r>
@@ -30083,7 +30086,7 @@
         <w:keepNext/>
         <w:spacing w:after="140"/>
       </w:pPr>
-      <w:bookmarkStart w:id="105" w:name="_Toc243264437"/>
+      <w:bookmarkStart w:id="105" w:name="_Toc243267483"/>
       <w:r>
         <w:t>Tratti e verifica delle sezioni</w:t>
       </w:r>
@@ -30126,7 +30129,7 @@
         <w:keepNext/>
         <w:spacing w:after="140"/>
       </w:pPr>
-      <w:bookmarkStart w:id="106" w:name="_Toc243264438"/>
+      <w:bookmarkStart w:id="106" w:name="_Toc243267484"/>
       <w:r>
         <w:t>Proposte e vista delle armature</w:t>
       </w:r>
@@ -30220,7 +30223,7 @@
         <w:keepNext/>
         <w:spacing w:after="140"/>
       </w:pPr>
-      <w:bookmarkStart w:id="107" w:name="_Toc243264439"/>
+      <w:bookmarkStart w:id="107" w:name="_Toc243267485"/>
       <w:r>
         <w:t>Esempio riproducibile e limiti</w:t>
       </w:r>
@@ -30251,7 +30254,7 @@
         <w:keepNext/>
         <w:spacing w:after="140"/>
       </w:pPr>
-      <w:bookmarkStart w:id="108" w:name="_Toc243264440"/>
+      <w:bookmarkStart w:id="108" w:name="_Toc243267486"/>
       <w:r>
         <w:lastRenderedPageBreak/>
         <w:t>Wiki e centro della conoscenza</w:t>
@@ -30264,7 +30267,7 @@
         <w:keepNext/>
         <w:spacing w:after="140"/>
       </w:pPr>
-      <w:bookmarkStart w:id="109" w:name="_Toc243264441"/>
+      <w:bookmarkStart w:id="109" w:name="_Toc243267487"/>
       <w:r>
         <w:t>Wiki del modulo e aiuti sui singoli dati</w:t>
       </w:r>
@@ -30292,7 +30295,7 @@
         <w:keepNext/>
         <w:spacing w:after="140"/>
       </w:pPr>
-      <w:bookmarkStart w:id="110" w:name="_Toc243264442"/>
+      <w:bookmarkStart w:id="110" w:name="_Toc243267488"/>
       <w:r>
         <w:t>Consultare la nuova biblioteca tecnica</w:t>
       </w:r>
@@ -30312,7 +30315,7 @@
         <w:keepNext/>
         <w:spacing w:after="140"/>
       </w:pPr>
-      <w:bookmarkStart w:id="111" w:name="_Toc243264443"/>
+      <w:bookmarkStart w:id="111" w:name="_Toc243267489"/>
       <w:r>
         <w:t>Engineering Handbook</w:t>
       </w:r>
@@ -30371,7 +30374,7 @@
         <w:keepNext/>
         <w:spacing w:after="140"/>
       </w:pPr>
-      <w:bookmarkStart w:id="112" w:name="_Toc243264444"/>
+      <w:bookmarkStart w:id="112" w:name="_Toc243267490"/>
       <w:r>
         <w:t>Cercare e scegliere un percorso</w:t>
       </w:r>
@@ -30391,7 +30394,7 @@
         <w:keepNext/>
         <w:spacing w:after="140"/>
       </w:pPr>
-      <w:bookmarkStart w:id="113" w:name="_Toc243264445"/>
+      <w:bookmarkStart w:id="113" w:name="_Toc243267491"/>
       <w:r>
         <w:t>Leggere e riprendere</w:t>
       </w:r>
@@ -30419,7 +30422,7 @@
         <w:keepNext/>
         <w:spacing w:after="140"/>
       </w:pPr>
-      <w:bookmarkStart w:id="114" w:name="_Toc243264446"/>
+      <w:bookmarkStart w:id="114" w:name="_Toc243267492"/>
       <w:r>
         <w:t>Passare dalla teoria al calcolo</w:t>
       </w:r>
@@ -30459,7 +30462,7 @@
         <w:keepNext/>
         <w:spacing w:after="140"/>
       </w:pPr>
-      <w:bookmarkStart w:id="115" w:name="_Toc243264447"/>
+      <w:bookmarkStart w:id="115" w:name="_Toc243267493"/>
       <w:r>
         <w:t>Progetti e problemi frequenti</w:t>
       </w:r>
@@ -30479,7 +30482,7 @@
         <w:keepNext/>
         <w:spacing w:after="140"/>
       </w:pPr>
-      <w:bookmarkStart w:id="116" w:name="_Toc243264448"/>
+      <w:bookmarkStart w:id="116" w:name="_Toc243267494"/>
       <w:r>
         <w:t>Modulo Sezione in c.a.</w:t>
       </w:r>
@@ -30491,7 +30494,7 @@
         <w:keepNext/>
         <w:spacing w:after="140"/>
       </w:pPr>
-      <w:bookmarkStart w:id="117" w:name="_Toc243264449"/>
+      <w:bookmarkStart w:id="117" w:name="_Toc243267495"/>
       <w:r>
         <w:t>Controllare norma e dati ereditati</w:t>
       </w:r>
@@ -30530,7 +30533,7 @@
         <w:keepNext/>
         <w:spacing w:after="140"/>
       </w:pPr>
-      <w:bookmarkStart w:id="118" w:name="_Toc243264450"/>
+      <w:bookmarkStart w:id="118" w:name="_Toc243267496"/>
       <w:r>
         <w:t>A cosa serve e quando usarlo</w:t>
       </w:r>
@@ -30558,7 +30561,7 @@
         <w:keepNext/>
         <w:spacing w:after="140"/>
       </w:pPr>
-      <w:bookmarkStart w:id="119" w:name="_Toc243264451"/>
+      <w:bookmarkStart w:id="119" w:name="_Toc243267497"/>
       <w:r>
         <w:lastRenderedPageBreak/>
         <w:t>Input geometria e unità</w:t>
@@ -31154,7 +31157,7 @@
         <w:keepNext/>
         <w:spacing w:after="140"/>
       </w:pPr>
-      <w:bookmarkStart w:id="120" w:name="_Toc243264452"/>
+      <w:bookmarkStart w:id="120" w:name="_Toc243267498"/>
       <w:r>
         <w:t>Input materiali armature e default</w:t>
       </w:r>
@@ -31190,7 +31193,7 @@
         <w:keepNext/>
         <w:spacing w:after="140"/>
       </w:pPr>
-      <w:bookmarkStart w:id="121" w:name="_Toc243264453"/>
+      <w:bookmarkStart w:id="121" w:name="_Toc243267499"/>
       <w:r>
         <w:lastRenderedPageBreak/>
         <w:t>Input azioni e convenzioni</w:t>
@@ -31219,7 +31222,7 @@
         <w:keepNext/>
         <w:spacing w:after="140"/>
       </w:pPr>
-      <w:bookmarkStart w:id="122" w:name="_Toc243264454"/>
+      <w:bookmarkStart w:id="122" w:name="_Toc243267500"/>
       <w:r>
         <w:t>Descrizione del calcolo</w:t>
       </w:r>
@@ -31247,7 +31250,7 @@
         <w:keepNext/>
         <w:spacing w:after="140"/>
       </w:pPr>
-      <w:bookmarkStart w:id="123" w:name="_Toc243264455"/>
+      <w:bookmarkStart w:id="123" w:name="_Toc243267501"/>
       <w:r>
         <w:t>Output e lettura dei risultati</w:t>
       </w:r>
@@ -31768,7 +31771,7 @@
         <w:keepNext/>
         <w:spacing w:after="140"/>
       </w:pPr>
-      <w:bookmarkStart w:id="124" w:name="_Toc243264456"/>
+      <w:bookmarkStart w:id="124" w:name="_Toc243267502"/>
       <w:r>
         <w:t>Warning e problemi frequenti</w:t>
       </w:r>
@@ -31806,7 +31809,7 @@
         <w:keepNext/>
         <w:spacing w:after="140"/>
       </w:pPr>
-      <w:bookmarkStart w:id="125" w:name="_Toc243264457"/>
+      <w:bookmarkStart w:id="125" w:name="_Toc243267503"/>
       <w:r>
         <w:t>Esempio completo dalla Wiki</w:t>
       </w:r>
@@ -31888,7 +31891,7 @@
         <w:keepNext/>
         <w:spacing w:after="140"/>
       </w:pPr>
-      <w:bookmarkStart w:id="126" w:name="_Toc243264458"/>
+      <w:bookmarkStart w:id="126" w:name="_Toc243267504"/>
       <w:r>
         <w:t>Teoria collegata e riepilogo</w:t>
       </w:r>
@@ -31917,7 +31920,7 @@
         <w:keepNext/>
         <w:spacing w:after="140"/>
       </w:pPr>
-      <w:bookmarkStart w:id="127" w:name="_Toc243264459"/>
+      <w:bookmarkStart w:id="127" w:name="_Toc243267505"/>
       <w:r>
         <w:t>Domini tridimensionali e bidimensionali</w:t>
       </w:r>
@@ -31988,7 +31991,7 @@
         <w:keepNext/>
         <w:spacing w:after="140"/>
       </w:pPr>
-      <w:bookmarkStart w:id="128" w:name="_Toc243264460"/>
+      <w:bookmarkStart w:id="128" w:name="_Toc243267506"/>
       <w:r>
         <w:t>Tensioni e fessurazione</w:t>
       </w:r>
@@ -32028,7 +32031,7 @@
         <w:keepNext/>
         <w:spacing w:after="140"/>
       </w:pPr>
-      <w:bookmarkStart w:id="129" w:name="_Toc243264461"/>
+      <w:bookmarkStart w:id="129" w:name="_Toc243267507"/>
       <w:r>
         <w:t>Taglio torsione e dettagli</w:t>
       </w:r>
@@ -32067,7 +32070,7 @@
         <w:keepNext/>
         <w:spacing w:after="140"/>
       </w:pPr>
-      <w:bookmarkStart w:id="130" w:name="_Toc243264462"/>
+      <w:bookmarkStart w:id="130" w:name="_Toc243267508"/>
       <w:r>
         <w:t>Curva momento curvatura e aggiornamento</w:t>
       </w:r>
@@ -32124,7 +32127,7 @@
         <w:keepNext/>
         <w:spacing w:after="140"/>
       </w:pPr>
-      <w:bookmarkStart w:id="131" w:name="_Toc243264463"/>
+      <w:bookmarkStart w:id="131" w:name="_Toc243267509"/>
       <w:r>
         <w:t>Importare ed esportare le azioni</w:t>
       </w:r>
@@ -32207,7 +32210,7 @@
         <w:keepNext/>
         <w:spacing w:after="140"/>
       </w:pPr>
-      <w:bookmarkStart w:id="132" w:name="_Toc243264464"/>
+      <w:bookmarkStart w:id="132" w:name="_Toc243267510"/>
       <w:r>
         <w:t>Report short della sezione in calcestruzzo armato</w:t>
       </w:r>
@@ -32251,7 +32254,7 @@
         <w:keepNext/>
         <w:spacing w:after="140"/>
       </w:pPr>
-      <w:bookmarkStart w:id="133" w:name="_Toc243264465"/>
+      <w:bookmarkStart w:id="133" w:name="_Toc243267511"/>
       <w:r>
         <w:t>Leggere asse neutro, mappe e report</w:t>
       </w:r>
@@ -32308,7 +32311,7 @@
         <w:keepNext/>
         <w:spacing w:after="140"/>
       </w:pPr>
-      <w:bookmarkStart w:id="134" w:name="_Toc243264466"/>
+      <w:bookmarkStart w:id="134" w:name="_Toc243267512"/>
       <w:r>
         <w:t>Interpretazione dei risultati e controlli indipendenti</w:t>
       </w:r>
@@ -32328,7 +32331,7 @@
         <w:keepNext/>
         <w:spacing w:after="140"/>
       </w:pPr>
-      <w:bookmarkStart w:id="135" w:name="_Toc243264467"/>
+      <w:bookmarkStart w:id="135" w:name="_Toc243267513"/>
       <w:r>
         <w:t>Dalla domanda alla capacità</w:t>
       </w:r>
@@ -32348,7 +32351,7 @@
         <w:keepNext/>
         <w:spacing w:after="140"/>
       </w:pPr>
-      <w:bookmarkStart w:id="136" w:name="_Toc243264468"/>
+      <w:bookmarkStart w:id="136" w:name="_Toc243267514"/>
       <w:r>
         <w:t>Controllo numerico e fisico</w:t>
       </w:r>
@@ -32368,7 +32371,7 @@
         <w:keepNext/>
         <w:spacing w:after="140"/>
       </w:pPr>
-      <w:bookmarkStart w:id="137" w:name="_Toc243264469"/>
+      <w:bookmarkStart w:id="137" w:name="_Toc243267515"/>
       <w:r>
         <w:t>Archiviazione</w:t>
       </w:r>
@@ -32388,7 +32391,7 @@
         <w:keepNext/>
         <w:spacing w:after="140"/>
       </w:pPr>
-      <w:bookmarkStart w:id="138" w:name="_Toc243264470"/>
+      <w:bookmarkStart w:id="138" w:name="_Toc243267516"/>
       <w:r>
         <w:t>Tutorial dal modello Beam alla verifica di sezione</w:t>
       </w:r>
@@ -32408,7 +32411,7 @@
         <w:keepNext/>
         <w:spacing w:after="140"/>
       </w:pPr>
-      <w:bookmarkStart w:id="139" w:name="_Toc243264471"/>
+      <w:bookmarkStart w:id="139" w:name="_Toc243267517"/>
       <w:r>
         <w:lastRenderedPageBreak/>
         <w:t>Capisci e controlla</w:t>
@@ -32429,7 +32432,7 @@
         <w:keepNext/>
         <w:spacing w:after="140"/>
       </w:pPr>
-      <w:bookmarkStart w:id="140" w:name="_Toc243264472"/>
+      <w:bookmarkStart w:id="140" w:name="_Toc243267518"/>
       <w:r>
         <w:t>Calcola e modifica</w:t>
       </w:r>
@@ -32449,7 +32452,7 @@
         <w:keepNext/>
         <w:spacing w:after="140"/>
       </w:pPr>
-      <w:bookmarkStart w:id="141" w:name="_Toc243264473"/>
+      <w:bookmarkStart w:id="141" w:name="_Toc243267519"/>
       <w:r>
         <w:t>Osserva e archivia</w:t>
       </w:r>
@@ -32469,7 +32472,7 @@
         <w:keepNext/>
         <w:spacing w:after="140"/>
       </w:pPr>
-      <w:bookmarkStart w:id="142" w:name="_Toc243264474"/>
+      <w:bookmarkStart w:id="142" w:name="_Toc243267520"/>
       <w:r>
         <w:t>Fondazioni superficiali</w:t>
       </w:r>
@@ -32500,7 +32503,7 @@
         <w:keepNext/>
         <w:spacing w:after="140"/>
       </w:pPr>
-      <w:bookmarkStart w:id="143" w:name="_Toc243264475"/>
+      <w:bookmarkStart w:id="143" w:name="_Toc243267521"/>
       <w:r>
         <w:t>Preparazione e scelta del metodo</w:t>
       </w:r>
@@ -32529,7 +32532,7 @@
         <w:keepNext/>
         <w:spacing w:after="140"/>
       </w:pPr>
-      <w:bookmarkStart w:id="144" w:name="_Toc243264476"/>
+      <w:bookmarkStart w:id="144" w:name="_Toc243267522"/>
       <w:r>
         <w:t>Geometria terreno falda e azioni</w:t>
       </w:r>
@@ -32689,7 +32692,7 @@
         <w:keepNext/>
         <w:spacing w:after="140"/>
       </w:pPr>
-      <w:bookmarkStart w:id="145" w:name="_Toc243264477"/>
+      <w:bookmarkStart w:id="145" w:name="_Toc243267523"/>
       <w:r>
         <w:t>Lettura delle viste grafiche</w:t>
       </w:r>
@@ -32787,7 +32790,7 @@
         <w:keepNext/>
         <w:spacing w:after="140"/>
       </w:pPr>
-      <w:bookmarkStart w:id="146" w:name="_Toc243264478"/>
+      <w:bookmarkStart w:id="146" w:name="_Toc243267524"/>
       <w:r>
         <w:t>Esempio verificato e lettura dei risultati</w:t>
       </w:r>
@@ -33484,7 +33487,7 @@
         <w:keepNext/>
         <w:spacing w:after="140"/>
       </w:pPr>
-      <w:bookmarkStart w:id="147" w:name="_Toc243264479"/>
+      <w:bookmarkStart w:id="147" w:name="_Toc243267525"/>
       <w:r>
         <w:t>Salvataggio errori e report</w:t>
       </w:r>
@@ -33520,7 +33523,7 @@
         <w:keepNext/>
         <w:spacing w:after="140"/>
       </w:pPr>
-      <w:bookmarkStart w:id="148" w:name="_Toc243264480"/>
+      <w:bookmarkStart w:id="148" w:name="_Toc243267526"/>
       <w:r>
         <w:lastRenderedPageBreak/>
         <w:t>Modelli e importazione da MIDAS</w:t>
@@ -33541,7 +33544,7 @@
         <w:keepNext/>
         <w:spacing w:after="140"/>
       </w:pPr>
-      <w:bookmarkStart w:id="149" w:name="_Toc243264481"/>
+      <w:bookmarkStart w:id="149" w:name="_Toc243267527"/>
       <w:r>
         <w:t>Entrare nel modulo</w:t>
       </w:r>
@@ -33641,7 +33644,7 @@
         <w:keepNext/>
         <w:spacing w:after="140"/>
       </w:pPr>
-      <w:bookmarkStart w:id="150" w:name="_Toc243264482"/>
+      <w:bookmarkStart w:id="150" w:name="_Toc243267528"/>
       <w:r>
         <w:t>Preparare la connessione</w:t>
       </w:r>
@@ -33687,7 +33690,7 @@
         <w:keepNext/>
         <w:spacing w:after="140"/>
       </w:pPr>
-      <w:bookmarkStart w:id="151" w:name="_Toc243264483"/>
+      <w:bookmarkStart w:id="151" w:name="_Toc243267529"/>
       <w:r>
         <w:t>Eseguire la prima importazione</w:t>
       </w:r>
@@ -33969,7 +33972,7 @@
         <w:keepNext/>
         <w:spacing w:after="140"/>
       </w:pPr>
-      <w:bookmarkStart w:id="152" w:name="_Toc243264484"/>
+      <w:bookmarkStart w:id="152" w:name="_Toc243267530"/>
       <w:r>
         <w:t>Scegliere il contenuto da acquisire</w:t>
       </w:r>
@@ -34319,7 +34322,7 @@
         <w:keepNext/>
         <w:spacing w:after="140"/>
       </w:pPr>
-      <w:bookmarkStart w:id="153" w:name="_Toc243264485"/>
+      <w:bookmarkStart w:id="153" w:name="_Toc243267531"/>
       <w:r>
         <w:lastRenderedPageBreak/>
         <w:t>Controllare il modello acquisito</w:t>
@@ -34455,7 +34458,7 @@
         <w:keepNext/>
         <w:spacing w:after="140"/>
       </w:pPr>
-      <w:bookmarkStart w:id="154" w:name="_Toc243264486"/>
+      <w:bookmarkStart w:id="154" w:name="_Toc243267532"/>
       <w:r>
         <w:t>Importare e visualizzare i risultati per fase</w:t>
       </w:r>
@@ -34606,7 +34609,7 @@
         <w:keepNext/>
         <w:spacing w:after="140"/>
       </w:pPr>
-      <w:bookmarkStart w:id="155" w:name="_Toc243264487"/>
+      <w:bookmarkStart w:id="155" w:name="_Toc243267533"/>
       <w:r>
         <w:t>Aggiornare una copia esistente</w:t>
       </w:r>
@@ -34670,7 +34673,7 @@
         <w:keepNext/>
         <w:spacing w:after="140"/>
       </w:pPr>
-      <w:bookmarkStart w:id="156" w:name="_Toc243264488"/>
+      <w:bookmarkStart w:id="156" w:name="_Toc243267534"/>
       <w:r>
         <w:t>Risolvere le interruzioni e conoscere i limiti</w:t>
       </w:r>
@@ -35093,7 +35096,7 @@
         <w:keepNext/>
         <w:spacing w:after="140"/>
       </w:pPr>
-      <w:bookmarkStart w:id="157" w:name="_Toc243264489"/>
+      <w:bookmarkStart w:id="157" w:name="_Toc243267535"/>
       <w:r>
         <w:t>Reologia del calcestruzzo</w:t>
       </w:r>
@@ -35122,7 +35125,7 @@
         <w:keepNext/>
         <w:spacing w:after="140"/>
       </w:pPr>
-      <w:bookmarkStart w:id="158" w:name="_Toc243264490"/>
+      <w:bookmarkStart w:id="158" w:name="_Toc243267536"/>
       <w:r>
         <w:t>Impostare materiale ambiente ed età</w:t>
       </w:r>
@@ -35159,7 +35162,7 @@
         <w:keepNext/>
         <w:spacing w:after="140"/>
       </w:pPr>
-      <w:bookmarkStart w:id="159" w:name="_Toc243264491"/>
+      <w:bookmarkStart w:id="159" w:name="_Toc243267537"/>
       <w:r>
         <w:t>Leggere grafico tabella e limite a infinito</w:t>
       </w:r>
@@ -35295,7 +35298,7 @@
         <w:keepNext/>
         <w:spacing w:after="140"/>
       </w:pPr>
-      <w:bookmarkStart w:id="160" w:name="_Toc243264492"/>
+      <w:bookmarkStart w:id="160" w:name="_Toc243267538"/>
       <w:r>
         <w:t>Usare il risultato nel progetto</w:t>
       </w:r>
@@ -35376,7 +35379,7 @@
         <w:keepNext/>
         <w:spacing w:after="140"/>
       </w:pPr>
-      <w:bookmarkStart w:id="161" w:name="_Toc243264493"/>
+      <w:bookmarkStart w:id="161" w:name="_Toc243267539"/>
       <w:r>
         <w:t>Esaminare le sezioni del modello</w:t>
       </w:r>
@@ -35428,7 +35431,7 @@
         </w:rPr>
         <w:lastRenderedPageBreak/>
         <w:drawing>
-          <wp:inline distT="0" distB="0" distL="0" distR="0" wp14:anchorId="22652F2D" wp14:editId="1ECF93F6">
+          <wp:inline distT="0" distB="0" distL="0" distR="0" wp14:anchorId="63E7007E" wp14:editId="300AD2B1">
             <wp:extent cx="6120000" cy="4267204"/>
             <wp:effectExtent l="0" t="0" r="0" b="0"/>
             <wp:docPr id="11" name="Picture 11" descr="Finestra di dettaglio con una sezione composta di esempio"/>
@@ -35478,7 +35481,7 @@
         <w:keepNext/>
         <w:spacing w:after="140"/>
       </w:pPr>
-      <w:bookmarkStart w:id="162" w:name="_Toc243264494"/>
+      <w:bookmarkStart w:id="162" w:name="_Toc243267540"/>
       <w:r>
         <w:t>Leggere geometria proprietà e attributi</w:t>
       </w:r>
@@ -35592,7 +35595,7 @@
         <w:keepNext/>
         <w:spacing w:after="140"/>
       </w:pPr>
-      <w:bookmarkStart w:id="163" w:name="_Toc243264495"/>
+      <w:bookmarkStart w:id="163" w:name="_Toc243267541"/>
       <w:r>
         <w:lastRenderedPageBreak/>
         <w:t>Individuare gli elementi e leggere i volumi</w:t>

</xml_diff>